<commit_message>
CPI-4 Phase 6: Pipeline Git Helper, code state fix, pipeline complete end to end
</commit_message>
<xml_diff>
--- a/output/ZFIN_OPEN_ITEMS___Finance_Open_Items_Report_FDS_v1_0.docx
+++ b/output/ZFIN_OPEN_ITEMS___Finance_Open_Items_Report_FDS_v1_0.docx
@@ -545,7 +545,7 @@
           <w:szCs w:val="22"/>
           <w:rFonts w:ascii="Arial" w:cs="Arial" w:eastAsia="Arial" w:hAnsi="Arial"/>
         </w:rPr>
-        <w:t xml:space="preserve">The Finance department requires a custom report to efficiently view and analyze open customer line items across different company codes. Currently, users must navigate through multiple SAP transactions to obtain consolidated open items information, which is time-consuming and prone to manual errors. This report will provide a centralized view of outstanding customer balances to support collections activities, cash flow analysis, and month-end reporting processes.</w:t>
+        <w:t xml:space="preserve">The Finance team requires a dedicated report to analyze open customer line items for cash flow management and collection activities. Currently, users must navigate through multiple standard SAP transactions to gather this information, leading to inefficiencies in the accounts receivable process. This custom report consolidates open item data with customer information in a single, user-friendly interface.</w:t>
       </w:r>
     </w:p>
     <w:p>
@@ -593,24 +593,7 @@
           <w:szCs w:val="22"/>
           <w:rFonts w:ascii="Arial" w:cs="Arial" w:eastAsia="Arial" w:hAnsi="Arial"/>
         </w:rPr>
-        <w:t xml:space="preserve">Custom ABAP report ZFIN_OPEN_ITEMS development</w:t>
-      </w:r>
-    </w:p>
-    <w:p>
-      <w:pPr>
-        <w:pStyle w:val="ListParagraph"/>
-        <w:numPr>
-          <w:ilvl w:val="0"/>
-          <w:numId w:val="2"/>
-        </w:numPr>
-      </w:pPr>
-      <w:r>
-        <w:rPr>
-          <w:sz w:val="22"/>
-          <w:szCs w:val="22"/>
-          <w:rFonts w:ascii="Arial" w:cs="Arial" w:eastAsia="Arial" w:hAnsi="Arial"/>
-        </w:rPr>
-        <w:t xml:space="preserve">ALV Grid display functionality</w:t>
+        <w:t xml:space="preserve">Display open customer line items from BSID table</w:t>
       </w:r>
     </w:p>
     <w:p>
@@ -644,41 +627,41 @@
           <w:szCs w:val="22"/>
           <w:rFonts w:ascii="Arial" w:cs="Arial" w:eastAsia="Arial" w:hAnsi="Arial"/>
         </w:rPr>
-        <w:t xml:space="preserve">Open line items extraction from BSID</w:t>
-      </w:r>
-    </w:p>
-    <w:p>
-      <w:pPr>
-        <w:pStyle w:val="ListParagraph"/>
-        <w:numPr>
-          <w:ilvl w:val="0"/>
-          <w:numId w:val="2"/>
-        </w:numPr>
-      </w:pPr>
-      <w:r>
-        <w:rPr>
-          <w:sz w:val="22"/>
-          <w:szCs w:val="22"/>
-          <w:rFonts w:ascii="Arial" w:cs="Arial" w:eastAsia="Arial" w:hAnsi="Arial"/>
-        </w:rPr>
-        <w:t xml:space="preserve">Company code and posting date filtering</w:t>
-      </w:r>
-    </w:p>
-    <w:p>
-      <w:pPr>
-        <w:pStyle w:val="ListParagraph"/>
-        <w:numPr>
-          <w:ilvl w:val="0"/>
-          <w:numId w:val="2"/>
-        </w:numPr>
-      </w:pPr>
-      <w:r>
-        <w:rPr>
-          <w:sz w:val="22"/>
-          <w:szCs w:val="22"/>
-          <w:rFonts w:ascii="Arial" w:cs="Arial" w:eastAsia="Arial" w:hAnsi="Arial"/>
-        </w:rPr>
-        <w:t xml:space="preserve">Authorization check implementation for F_BKPF_BUK</w:t>
+        <w:t xml:space="preserve">Filtering by company code and posting date range</w:t>
+      </w:r>
+    </w:p>
+    <w:p>
+      <w:pPr>
+        <w:pStyle w:val="ListParagraph"/>
+        <w:numPr>
+          <w:ilvl w:val="0"/>
+          <w:numId w:val="2"/>
+        </w:numPr>
+      </w:pPr>
+      <w:r>
+        <w:rPr>
+          <w:sz w:val="22"/>
+          <w:szCs w:val="22"/>
+          <w:rFonts w:ascii="Arial" w:cs="Arial" w:eastAsia="Arial" w:hAnsi="Arial"/>
+        </w:rPr>
+        <w:t xml:space="preserve">ALV Grid display with standard ALV functions</w:t>
+      </w:r>
+    </w:p>
+    <w:p>
+      <w:pPr>
+        <w:pStyle w:val="ListParagraph"/>
+        <w:numPr>
+          <w:ilvl w:val="0"/>
+          <w:numId w:val="2"/>
+        </w:numPr>
+      </w:pPr>
+      <w:r>
+        <w:rPr>
+          <w:sz w:val="22"/>
+          <w:szCs w:val="22"/>
+          <w:rFonts w:ascii="Arial" w:cs="Arial" w:eastAsia="Arial" w:hAnsi="Arial"/>
+        </w:rPr>
+        <w:t xml:space="preserve">Authorization check for F_BKPF_BUK object</w:t>
       </w:r>
     </w:p>
     <w:p>
@@ -725,109 +708,109 @@
           <w:szCs w:val="22"/>
           <w:rFonts w:ascii="Arial" w:cs="Arial" w:eastAsia="Arial" w:hAnsi="Arial"/>
         </w:rPr>
-        <w:t xml:space="preserve">Modification of standard SAP transactions</w:t>
-      </w:r>
-    </w:p>
-    <w:p>
-      <w:pPr>
-        <w:pStyle w:val="ListParagraph"/>
-        <w:numPr>
-          <w:ilvl w:val="0"/>
-          <w:numId w:val="2"/>
-        </w:numPr>
-      </w:pPr>
-      <w:r>
-        <w:rPr>
-          <w:sz w:val="22"/>
-          <w:szCs w:val="22"/>
-          <w:rFonts w:ascii="Arial" w:cs="Arial" w:eastAsia="Arial" w:hAnsi="Arial"/>
-        </w:rPr>
-        <w:t xml:space="preserve">Real-time data updates or write-back functionality</w:t>
-      </w:r>
-    </w:p>
-    <w:p>
-      <w:pPr>
-        <w:pStyle w:val="ListParagraph"/>
-        <w:numPr>
-          <w:ilvl w:val="0"/>
-          <w:numId w:val="2"/>
-        </w:numPr>
-      </w:pPr>
-      <w:r>
-        <w:rPr>
-          <w:sz w:val="22"/>
-          <w:szCs w:val="22"/>
-          <w:rFonts w:ascii="Arial" w:cs="Arial" w:eastAsia="Arial" w:hAnsi="Arial"/>
-        </w:rPr>
-        <w:t xml:space="preserve">Export to external systems via RFC/ALE</w:t>
-      </w:r>
-    </w:p>
-    <w:p>
-      <w:pPr>
-        <w:pStyle w:val="ListParagraph"/>
-        <w:numPr>
-          <w:ilvl w:val="0"/>
-          <w:numId w:val="2"/>
-        </w:numPr>
-      </w:pPr>
-      <w:r>
-        <w:rPr>
-          <w:sz w:val="22"/>
-          <w:szCs w:val="22"/>
-          <w:rFonts w:ascii="Arial" w:cs="Arial" w:eastAsia="Arial" w:hAnsi="Arial"/>
-        </w:rPr>
-        <w:t xml:space="preserve">Custom authorization objects creation</w:t>
-      </w:r>
-    </w:p>
-    <w:p>
-      <w:pPr>
-        <w:pStyle w:val="ListParagraph"/>
-        <w:numPr>
-          <w:ilvl w:val="0"/>
-          <w:numId w:val="2"/>
-        </w:numPr>
-      </w:pPr>
-      <w:r>
-        <w:rPr>
-          <w:sz w:val="22"/>
-          <w:szCs w:val="22"/>
-          <w:rFonts w:ascii="Arial" w:cs="Arial" w:eastAsia="Arial" w:hAnsi="Arial"/>
-        </w:rPr>
-        <w:t xml:space="preserve">Integration with non-SAP systems</w:t>
-      </w:r>
-    </w:p>
-    <w:p>
-      <w:pPr>
-        <w:pStyle w:val="ListParagraph"/>
-        <w:numPr>
-          <w:ilvl w:val="0"/>
-          <w:numId w:val="2"/>
-        </w:numPr>
-      </w:pPr>
-      <w:r>
-        <w:rPr>
-          <w:sz w:val="22"/>
-          <w:szCs w:val="22"/>
-          <w:rFonts w:ascii="Arial" w:cs="Arial" w:eastAsia="Arial" w:hAnsi="Arial"/>
-        </w:rPr>
-        <w:t xml:space="preserve">Batch job scheduling configuration</w:t>
-      </w:r>
-    </w:p>
-    <w:p>
-      <w:pPr>
-        <w:pStyle w:val="ListParagraph"/>
-        <w:numPr>
-          <w:ilvl w:val="0"/>
-          <w:numId w:val="2"/>
-        </w:numPr>
-      </w:pPr>
-      <w:r>
-        <w:rPr>
-          <w:sz w:val="22"/>
-          <w:szCs w:val="22"/>
-          <w:rFonts w:ascii="Arial" w:cs="Arial" w:eastAsia="Arial" w:hAnsi="Arial"/>
-        </w:rPr>
-        <w:t xml:space="preserve">Email notification functionality</w:t>
+        <w:t xml:space="preserve">Line item modification or deletion capabilities</w:t>
+      </w:r>
+    </w:p>
+    <w:p>
+      <w:pPr>
+        <w:pStyle w:val="ListParagraph"/>
+        <w:numPr>
+          <w:ilvl w:val="0"/>
+          <w:numId w:val="2"/>
+        </w:numPr>
+      </w:pPr>
+      <w:r>
+        <w:rPr>
+          <w:sz w:val="22"/>
+          <w:szCs w:val="22"/>
+          <w:rFonts w:ascii="Arial" w:cs="Arial" w:eastAsia="Arial" w:hAnsi="Arial"/>
+        </w:rPr>
+        <w:t xml:space="preserve">Integration with third-party systems</w:t>
+      </w:r>
+    </w:p>
+    <w:p>
+      <w:pPr>
+        <w:pStyle w:val="ListParagraph"/>
+        <w:numPr>
+          <w:ilvl w:val="0"/>
+          <w:numId w:val="2"/>
+        </w:numPr>
+      </w:pPr>
+      <w:r>
+        <w:rPr>
+          <w:sz w:val="22"/>
+          <w:szCs w:val="22"/>
+          <w:rFonts w:ascii="Arial" w:cs="Arial" w:eastAsia="Arial" w:hAnsi="Arial"/>
+        </w:rPr>
+        <w:t xml:space="preserve">Email or print functionality</w:t>
+      </w:r>
+    </w:p>
+    <w:p>
+      <w:pPr>
+        <w:pStyle w:val="ListParagraph"/>
+        <w:numPr>
+          <w:ilvl w:val="0"/>
+          <w:numId w:val="2"/>
+        </w:numPr>
+      </w:pPr>
+      <w:r>
+        <w:rPr>
+          <w:sz w:val="22"/>
+          <w:szCs w:val="22"/>
+          <w:rFonts w:ascii="Arial" w:cs="Arial" w:eastAsia="Arial" w:hAnsi="Arial"/>
+        </w:rPr>
+        <w:t xml:space="preserve">Vendor open items (AP functionality)</w:t>
+      </w:r>
+    </w:p>
+    <w:p>
+      <w:pPr>
+        <w:pStyle w:val="ListParagraph"/>
+        <w:numPr>
+          <w:ilvl w:val="0"/>
+          <w:numId w:val="2"/>
+        </w:numPr>
+      </w:pPr>
+      <w:r>
+        <w:rPr>
+          <w:sz w:val="22"/>
+          <w:szCs w:val="22"/>
+          <w:rFonts w:ascii="Arial" w:cs="Arial" w:eastAsia="Arial" w:hAnsi="Arial"/>
+        </w:rPr>
+        <w:t xml:space="preserve">Cleared line items display</w:t>
+      </w:r>
+    </w:p>
+    <w:p>
+      <w:pPr>
+        <w:pStyle w:val="ListParagraph"/>
+        <w:numPr>
+          <w:ilvl w:val="0"/>
+          <w:numId w:val="2"/>
+        </w:numPr>
+      </w:pPr>
+      <w:r>
+        <w:rPr>
+          <w:sz w:val="22"/>
+          <w:szCs w:val="22"/>
+          <w:rFonts w:ascii="Arial" w:cs="Arial" w:eastAsia="Arial" w:hAnsi="Arial"/>
+        </w:rPr>
+        <w:t xml:space="preserve">Multi-currency conversion beyond local currency</w:t>
+      </w:r>
+    </w:p>
+    <w:p>
+      <w:pPr>
+        <w:pStyle w:val="ListParagraph"/>
+        <w:numPr>
+          <w:ilvl w:val="0"/>
+          <w:numId w:val="2"/>
+        </w:numPr>
+      </w:pPr>
+      <w:r>
+        <w:rPr>
+          <w:sz w:val="22"/>
+          <w:szCs w:val="22"/>
+          <w:rFonts w:ascii="Arial" w:cs="Arial" w:eastAsia="Arial" w:hAnsi="Arial"/>
+        </w:rPr>
+        <w:t xml:space="preserve">Dunning level information</w:t>
       </w:r>
     </w:p>
     <w:p>
@@ -855,7 +838,7 @@
           <w:szCs w:val="22"/>
           <w:rFonts w:ascii="Arial" w:cs="Arial" w:eastAsia="Arial" w:hAnsi="Arial"/>
         </w:rPr>
-        <w:t xml:space="preserve">Users access the custom report ZFIN_OPEN_ITEMS through transaction code execution. The system presents a selection screen where users enter company code and posting date range parameters. Upon execution, the report performs authorization validation against F_BKPF_BUK object, retrieves customer master data from KNA1, extracts open line items from BSID table based on filter criteria, combines the datasets, and displays results in an ALV Grid format. Users can utilize standard ALV functionality for sorting, filtering, and local file export.</w:t>
+        <w:t xml:space="preserve">Finance users access the ZFIN_OPEN_ITEMS report through transaction SE38 or via custom menu. Users input selection criteria including mandatory company code and optional posting date range. The system validates user authorization for the specified company code(s) using F_BKPF_BUK authorization object. Upon successful authorization, the system retrieves open line items from BSID table and enriches data with customer names from KNA1 table. Results display in ALV Grid format with standard sorting, filtering, and export capabilities.</w:t>
       </w:r>
     </w:p>
     <w:p>
@@ -1013,7 +996,7 @@
                 <w:szCs w:val="20"/>
                 <w:rFonts w:ascii="Arial" w:cs="Arial" w:eastAsia="Arial" w:hAnsi="Arial"/>
               </w:rPr>
-              <w:t xml:space="preserve">FR001</w:t>
+              <w:t xml:space="preserve">FR01</w:t>
             </w:r>
           </w:p>
         </w:tc>
@@ -1041,7 +1024,7 @@
                 <w:szCs w:val="20"/>
                 <w:rFonts w:ascii="Arial" w:cs="Arial" w:eastAsia="Arial" w:hAnsi="Arial"/>
               </w:rPr>
-              <w:t xml:space="preserve">Selection screen must provide input fields for Company Code (mandatory) and Posting Date range (optional)</w:t>
+              <w:t xml:space="preserve">Report must display only open line items where BSID-AUGBL is initial</w:t>
             </w:r>
           </w:p>
         </w:tc>
@@ -1099,7 +1082,7 @@
                 <w:szCs w:val="20"/>
                 <w:rFonts w:ascii="Arial" w:cs="Arial" w:eastAsia="Arial" w:hAnsi="Arial"/>
               </w:rPr>
-              <w:t xml:space="preserve">FR002</w:t>
+              <w:t xml:space="preserve">FR02</w:t>
             </w:r>
           </w:p>
         </w:tc>
@@ -1127,7 +1110,7 @@
                 <w:szCs w:val="20"/>
                 <w:rFonts w:ascii="Arial" w:cs="Arial" w:eastAsia="Arial" w:hAnsi="Arial"/>
               </w:rPr>
-              <w:t xml:space="preserve">System must validate user authorization against F_BKPF_BUK authorization object for specified company code</w:t>
+              <w:t xml:space="preserve">Selection screen must include mandatory company code parameter</w:t>
             </w:r>
           </w:p>
         </w:tc>
@@ -1185,7 +1168,7 @@
                 <w:szCs w:val="20"/>
                 <w:rFonts w:ascii="Arial" w:cs="Arial" w:eastAsia="Arial" w:hAnsi="Arial"/>
               </w:rPr>
-              <w:t xml:space="preserve">FR003</w:t>
+              <w:t xml:space="preserve">FR03</w:t>
             </w:r>
           </w:p>
         </w:tc>
@@ -1213,7 +1196,7 @@
                 <w:szCs w:val="20"/>
                 <w:rFonts w:ascii="Arial" w:cs="Arial" w:eastAsia="Arial" w:hAnsi="Arial"/>
               </w:rPr>
-              <w:t xml:space="preserve">Report must extract open line items from BSID table filtered by company code and posting date range</w:t>
+              <w:t xml:space="preserve">Selection screen must include optional posting date range parameters</w:t>
             </w:r>
           </w:p>
         </w:tc>
@@ -1241,7 +1224,7 @@
                 <w:szCs w:val="20"/>
                 <w:rFonts w:ascii="Arial" w:cs="Arial" w:eastAsia="Arial" w:hAnsi="Arial"/>
               </w:rPr>
-              <w:t xml:space="preserve">High</w:t>
+              <w:t xml:space="preserve">Medium</w:t>
             </w:r>
           </w:p>
         </w:tc>
@@ -1271,7 +1254,7 @@
                 <w:szCs w:val="20"/>
                 <w:rFonts w:ascii="Arial" w:cs="Arial" w:eastAsia="Arial" w:hAnsi="Arial"/>
               </w:rPr>
-              <w:t xml:space="preserve">FR004</w:t>
+              <w:t xml:space="preserve">FR04</w:t>
             </w:r>
           </w:p>
         </w:tc>
@@ -1299,7 +1282,7 @@
                 <w:szCs w:val="20"/>
                 <w:rFonts w:ascii="Arial" w:cs="Arial" w:eastAsia="Arial" w:hAnsi="Arial"/>
               </w:rPr>
-              <w:t xml:space="preserve">System must retrieve customer master data from KNA1 table to obtain customer names</w:t>
+              <w:t xml:space="preserve">System must perform authorization check for F_BKPF_BUK before data retrieval</w:t>
             </w:r>
           </w:p>
         </w:tc>
@@ -1357,7 +1340,7 @@
                 <w:szCs w:val="20"/>
                 <w:rFonts w:ascii="Arial" w:cs="Arial" w:eastAsia="Arial" w:hAnsi="Arial"/>
               </w:rPr>
-              <w:t xml:space="preserve">FR005</w:t>
+              <w:t xml:space="preserve">FR05</w:t>
             </w:r>
           </w:p>
         </w:tc>
@@ -1385,7 +1368,7 @@
                 <w:szCs w:val="20"/>
                 <w:rFonts w:ascii="Arial" w:cs="Arial" w:eastAsia="Arial" w:hAnsi="Arial"/>
               </w:rPr>
-              <w:t xml:space="preserve">Output must display Customer Number, Customer Name, Document Number, Posting Date, Amount in Local Currency, and Due Date</w:t>
+              <w:t xml:space="preserve">Report output must display customer number, customer name, document number, posting date, amount in local currency, and due date</w:t>
             </w:r>
           </w:p>
         </w:tc>
@@ -1443,7 +1426,7 @@
                 <w:szCs w:val="20"/>
                 <w:rFonts w:ascii="Arial" w:cs="Arial" w:eastAsia="Arial" w:hAnsi="Arial"/>
               </w:rPr>
-              <w:t xml:space="preserve">FR006</w:t>
+              <w:t xml:space="preserve">FR06</w:t>
             </w:r>
           </w:p>
         </w:tc>
@@ -1471,7 +1454,7 @@
                 <w:szCs w:val="20"/>
                 <w:rFonts w:ascii="Arial" w:cs="Arial" w:eastAsia="Arial" w:hAnsi="Arial"/>
               </w:rPr>
-              <w:t xml:space="preserve">Results must be presented using ALV Grid with standard ALV functionality enabled</w:t>
+              <w:t xml:space="preserve">Output must be presented using ALV Grid with standard ALV functionality</w:t>
             </w:r>
           </w:p>
         </w:tc>
@@ -1529,7 +1512,7 @@
                 <w:szCs w:val="20"/>
                 <w:rFonts w:ascii="Arial" w:cs="Arial" w:eastAsia="Arial" w:hAnsi="Arial"/>
               </w:rPr>
-              <w:t xml:space="preserve">FR007</w:t>
+              <w:t xml:space="preserve">FR07</w:t>
             </w:r>
           </w:p>
         </w:tc>
@@ -1557,7 +1540,7 @@
                 <w:szCs w:val="20"/>
                 <w:rFonts w:ascii="Arial" w:cs="Arial" w:eastAsia="Arial" w:hAnsi="Arial"/>
               </w:rPr>
-              <w:t xml:space="preserve">Report must handle scenarios where no data is found and display appropriate message</w:t>
+              <w:t xml:space="preserve">Customer name must be retrieved from KNA1 table based on customer number</w:t>
             </w:r>
           </w:p>
         </w:tc>
@@ -1615,7 +1598,7 @@
                 <w:szCs w:val="20"/>
                 <w:rFonts w:ascii="Arial" w:cs="Arial" w:eastAsia="Arial" w:hAnsi="Arial"/>
               </w:rPr>
-              <w:t xml:space="preserve">FR008</w:t>
+              <w:t xml:space="preserve">FR08</w:t>
             </w:r>
           </w:p>
         </w:tc>
@@ -1643,7 +1626,7 @@
                 <w:szCs w:val="20"/>
                 <w:rFonts w:ascii="Arial" w:cs="Arial" w:eastAsia="Arial" w:hAnsi="Arial"/>
               </w:rPr>
-              <w:t xml:space="preserve">System must provide performance optimization for large data volumes</w:t>
+              <w:t xml:space="preserve">Report must handle cases where customer master data is not found</w:t>
             </w:r>
           </w:p>
         </w:tc>
@@ -1702,7 +1685,7 @@
           <w:szCs w:val="22"/>
           <w:rFonts w:ascii="Arial" w:cs="Arial" w:eastAsia="Arial" w:hAnsi="Arial"/>
         </w:rPr>
-        <w:t xml:space="preserve">Selection screen contains Company Code input field (mandatory, with F4 help), Posting Date From field (optional), and Posting Date To field (optional). ALV Grid output displays tabular data with columns: Customer Number (10 characters), Customer Name (35 characters), Document Number (10 characters), Posting Date (10 characters), Amount in Local Currency (15 characters with 2 decimals), and Due Date (10 characters). Standard ALV toolbar provides sorting, filtering, sum, and export functionality.</w:t>
+        <w:t xml:space="preserve">Selection screen contains Company Code field (mandatory, BUKRS type) and Posting Date range fields (optional, BUDAT type with FROM/TO parameters). ALV Grid displays tabular output with columns: Customer Number (KUNNR), Customer Name (NAME1), Document Number (BELNR), Posting Date (BUDAT), Amount in Local Currency (DMBTR), and Due Date (NETDT). Standard ALV toolbar provides sort, filter, sum, and export functions.</w:t>
       </w:r>
     </w:p>
     <w:p>
@@ -1730,7 +1713,7 @@
           <w:szCs w:val="22"/>
           <w:rFonts w:ascii="Arial" w:cs="Arial" w:eastAsia="Arial" w:hAnsi="Arial"/>
         </w:rPr>
-        <w:t xml:space="preserve">Input: Company Code (BUKRS from T001), Posting Date From (BUDAT), Posting Date To (BUDAT). Data Sources: KNA1 (Customer Master General Data) for customer number and name, BSID (Accounting: Secondary Index for Customers) for open line items including document number, posting date, amount in local currency, and due date. Output: Structured internal table displayed via ALV Grid containing combined customer and line item information meeting filter criteria.</w:t>
+        <w:t xml:space="preserve">Input: Company Code (BUKRS - mandatory), Posting Date From (BUDAT - optional), Posting Date To (BUDAT - optional). Data Sources: BSID (Customer Line Items), KNA1 (Customer Master). Output Fields: Customer Number (BSID-KUNNR), Customer Name (KNA1-NAME1), Document Number (BSID-BELNR), Posting Date (BSID-BUDAT), Amount Local Currency (BSID-DMBTR), Due Date (BSID-NETDT). Output Format: ALV Grid with approximately 1000-5000 records per execution depending on selection criteria.</w:t>
       </w:r>
     </w:p>
     <w:p>
@@ -1765,109 +1748,109 @@
           <w:szCs w:val="22"/>
           <w:rFonts w:ascii="Arial" w:cs="Arial" w:eastAsia="Arial" w:hAnsi="Arial"/>
         </w:rPr>
-        <w:t xml:space="preserve">Only open line items (AUGBL is initial) are included in the report output</w:t>
-      </w:r>
-    </w:p>
-    <w:p>
-      <w:pPr>
-        <w:pStyle w:val="ListParagraph"/>
-        <w:numPr>
-          <w:ilvl w:val="0"/>
-          <w:numId w:val="2"/>
-        </w:numPr>
-      </w:pPr>
-      <w:r>
-        <w:rPr>
-          <w:sz w:val="22"/>
-          <w:szCs w:val="22"/>
-          <w:rFonts w:ascii="Arial" w:cs="Arial" w:eastAsia="Arial" w:hAnsi="Arial"/>
-        </w:rPr>
-        <w:t xml:space="preserve">Company Code is mandatory and must exist in table T001</w:t>
-      </w:r>
-    </w:p>
-    <w:p>
-      <w:pPr>
-        <w:pStyle w:val="ListParagraph"/>
-        <w:numPr>
-          <w:ilvl w:val="0"/>
-          <w:numId w:val="2"/>
-        </w:numPr>
-      </w:pPr>
-      <w:r>
-        <w:rPr>
-          <w:sz w:val="22"/>
-          <w:szCs w:val="22"/>
-          <w:rFonts w:ascii="Arial" w:cs="Arial" w:eastAsia="Arial" w:hAnsi="Arial"/>
-        </w:rPr>
-        <w:t xml:space="preserve">Posting date range is optional - if not provided, all open items for the company code are displayed</w:t>
-      </w:r>
-    </w:p>
-    <w:p>
-      <w:pPr>
-        <w:pStyle w:val="ListParagraph"/>
-        <w:numPr>
-          <w:ilvl w:val="0"/>
-          <w:numId w:val="2"/>
-        </w:numPr>
-      </w:pPr>
-      <w:r>
-        <w:rPr>
-          <w:sz w:val="22"/>
-          <w:szCs w:val="22"/>
-          <w:rFonts w:ascii="Arial" w:cs="Arial" w:eastAsia="Arial" w:hAnsi="Arial"/>
-        </w:rPr>
-        <w:t xml:space="preserve">If posting date range is provided, both FROM and TO dates are inclusive in the selection</w:t>
-      </w:r>
-    </w:p>
-    <w:p>
-      <w:pPr>
-        <w:pStyle w:val="ListParagraph"/>
-        <w:numPr>
-          <w:ilvl w:val="0"/>
-          <w:numId w:val="2"/>
-        </w:numPr>
-      </w:pPr>
-      <w:r>
-        <w:rPr>
-          <w:sz w:val="22"/>
-          <w:szCs w:val="22"/>
-          <w:rFonts w:ascii="Arial" w:cs="Arial" w:eastAsia="Arial" w:hAnsi="Arial"/>
-        </w:rPr>
-        <w:t xml:space="preserve">Amount in local currency is displayed with appropriate decimal places based on currency configuration</w:t>
-      </w:r>
-    </w:p>
-    <w:p>
-      <w:pPr>
-        <w:pStyle w:val="ListParagraph"/>
-        <w:numPr>
-          <w:ilvl w:val="0"/>
-          <w:numId w:val="2"/>
-        </w:numPr>
-      </w:pPr>
-      <w:r>
-        <w:rPr>
-          <w:sz w:val="22"/>
-          <w:szCs w:val="22"/>
-          <w:rFonts w:ascii="Arial" w:cs="Arial" w:eastAsia="Arial" w:hAnsi="Arial"/>
-        </w:rPr>
-        <w:t xml:space="preserve">Due date calculation considers payment terms and baseline date from line item</w:t>
-      </w:r>
-    </w:p>
-    <w:p>
-      <w:pPr>
-        <w:pStyle w:val="ListParagraph"/>
-        <w:numPr>
-          <w:ilvl w:val="0"/>
-          <w:numId w:val="2"/>
-        </w:numPr>
-      </w:pPr>
-      <w:r>
-        <w:rPr>
-          <w:sz w:val="22"/>
-          <w:szCs w:val="22"/>
-          <w:rFonts w:ascii="Arial" w:cs="Arial" w:eastAsia="Arial" w:hAnsi="Arial"/>
-        </w:rPr>
-        <w:t xml:space="preserve">Only customers with open balances are included in the output</w:t>
+        <w:t xml:space="preserve">Only open line items where clearing document (AUGBL) is initial are displayed</w:t>
+      </w:r>
+    </w:p>
+    <w:p>
+      <w:pPr>
+        <w:pStyle w:val="ListParagraph"/>
+        <w:numPr>
+          <w:ilvl w:val="0"/>
+          <w:numId w:val="2"/>
+        </w:numPr>
+      </w:pPr>
+      <w:r>
+        <w:rPr>
+          <w:sz w:val="22"/>
+          <w:szCs w:val="22"/>
+          <w:rFonts w:ascii="Arial" w:cs="Arial" w:eastAsia="Arial" w:hAnsi="Arial"/>
+        </w:rPr>
+        <w:t xml:space="preserve">Authorization check for F_BKPF_BUK must pass for each company code in selection</w:t>
+      </w:r>
+    </w:p>
+    <w:p>
+      <w:pPr>
+        <w:pStyle w:val="ListParagraph"/>
+        <w:numPr>
+          <w:ilvl w:val="0"/>
+          <w:numId w:val="2"/>
+        </w:numPr>
+      </w:pPr>
+      <w:r>
+        <w:rPr>
+          <w:sz w:val="22"/>
+          <w:szCs w:val="22"/>
+          <w:rFonts w:ascii="Arial" w:cs="Arial" w:eastAsia="Arial" w:hAnsi="Arial"/>
+        </w:rPr>
+        <w:t xml:space="preserve">If posting date range is provided, both FROM and TO dates must be populated</w:t>
+      </w:r>
+    </w:p>
+    <w:p>
+      <w:pPr>
+        <w:pStyle w:val="ListParagraph"/>
+        <w:numPr>
+          <w:ilvl w:val="0"/>
+          <w:numId w:val="2"/>
+        </w:numPr>
+      </w:pPr>
+      <w:r>
+        <w:rPr>
+          <w:sz w:val="22"/>
+          <w:szCs w:val="22"/>
+          <w:rFonts w:ascii="Arial" w:cs="Arial" w:eastAsia="Arial" w:hAnsi="Arial"/>
+        </w:rPr>
+        <w:t xml:space="preserve">Customer name defaults to 'NOT FOUND' if customer number does not exist in KNA1</w:t>
+      </w:r>
+    </w:p>
+    <w:p>
+      <w:pPr>
+        <w:pStyle w:val="ListParagraph"/>
+        <w:numPr>
+          <w:ilvl w:val="0"/>
+          <w:numId w:val="2"/>
+        </w:numPr>
+      </w:pPr>
+      <w:r>
+        <w:rPr>
+          <w:sz w:val="22"/>
+          <w:szCs w:val="22"/>
+          <w:rFonts w:ascii="Arial" w:cs="Arial" w:eastAsia="Arial" w:hAnsi="Arial"/>
+        </w:rPr>
+        <w:t xml:space="preserve">Amount displays with standard currency formatting for local currency</w:t>
+      </w:r>
+    </w:p>
+    <w:p>
+      <w:pPr>
+        <w:pStyle w:val="ListParagraph"/>
+        <w:numPr>
+          <w:ilvl w:val="0"/>
+          <w:numId w:val="2"/>
+        </w:numPr>
+      </w:pPr>
+      <w:r>
+        <w:rPr>
+          <w:sz w:val="22"/>
+          <w:szCs w:val="22"/>
+          <w:rFonts w:ascii="Arial" w:cs="Arial" w:eastAsia="Arial" w:hAnsi="Arial"/>
+        </w:rPr>
+        <w:t xml:space="preserve">Due date calculation follows standard SAP payment terms logic</w:t>
+      </w:r>
+    </w:p>
+    <w:p>
+      <w:pPr>
+        <w:pStyle w:val="ListParagraph"/>
+        <w:numPr>
+          <w:ilvl w:val="0"/>
+          <w:numId w:val="2"/>
+        </w:numPr>
+      </w:pPr>
+      <w:r>
+        <w:rPr>
+          <w:sz w:val="22"/>
+          <w:szCs w:val="22"/>
+          <w:rFonts w:ascii="Arial" w:cs="Arial" w:eastAsia="Arial" w:hAnsi="Arial"/>
+        </w:rPr>
+        <w:t xml:space="preserve">Maximum of 50,000 records can be displayed to prevent performance issues</w:t>
       </w:r>
     </w:p>
     <w:p>
@@ -1902,92 +1885,92 @@
           <w:szCs w:val="22"/>
           <w:rFonts w:ascii="Arial" w:cs="Arial" w:eastAsia="Arial" w:hAnsi="Arial"/>
         </w:rPr>
-        <w:t xml:space="preserve">Display error message when user lacks authorization for specified company code via F_BKPF_BUK</w:t>
-      </w:r>
-    </w:p>
-    <w:p>
-      <w:pPr>
-        <w:pStyle w:val="ListParagraph"/>
-        <w:numPr>
-          <w:ilvl w:val="0"/>
-          <w:numId w:val="2"/>
-        </w:numPr>
-      </w:pPr>
-      <w:r>
-        <w:rPr>
-          <w:sz w:val="22"/>
-          <w:szCs w:val="22"/>
-          <w:rFonts w:ascii="Arial" w:cs="Arial" w:eastAsia="Arial" w:hAnsi="Arial"/>
-        </w:rPr>
-        <w:t xml:space="preserve">Show informational message when no open items exist for selection criteria</w:t>
-      </w:r>
-    </w:p>
-    <w:p>
-      <w:pPr>
-        <w:pStyle w:val="ListParagraph"/>
-        <w:numPr>
-          <w:ilvl w:val="0"/>
-          <w:numId w:val="2"/>
-        </w:numPr>
-      </w:pPr>
-      <w:r>
-        <w:rPr>
-          <w:sz w:val="22"/>
-          <w:szCs w:val="22"/>
-          <w:rFonts w:ascii="Arial" w:cs="Arial" w:eastAsia="Arial" w:hAnsi="Arial"/>
-        </w:rPr>
-        <w:t xml:space="preserve">Handle invalid company code entry with appropriate error message and field highlighting</w:t>
-      </w:r>
-    </w:p>
-    <w:p>
-      <w:pPr>
-        <w:pStyle w:val="ListParagraph"/>
-        <w:numPr>
-          <w:ilvl w:val="0"/>
-          <w:numId w:val="2"/>
-        </w:numPr>
-      </w:pPr>
-      <w:r>
-        <w:rPr>
-          <w:sz w:val="22"/>
-          <w:szCs w:val="22"/>
-          <w:rFonts w:ascii="Arial" w:cs="Arial" w:eastAsia="Arial" w:hAnsi="Arial"/>
-        </w:rPr>
-        <w:t xml:space="preserve">Manage database exceptions during BSID and KNA1 table access with technical error messages</w:t>
-      </w:r>
-    </w:p>
-    <w:p>
-      <w:pPr>
-        <w:pStyle w:val="ListParagraph"/>
-        <w:numPr>
-          <w:ilvl w:val="0"/>
-          <w:numId w:val="2"/>
-        </w:numPr>
-      </w:pPr>
-      <w:r>
-        <w:rPr>
-          <w:sz w:val="22"/>
-          <w:szCs w:val="22"/>
-          <w:rFonts w:ascii="Arial" w:cs="Arial" w:eastAsia="Arial" w:hAnsi="Arial"/>
-        </w:rPr>
-        <w:t xml:space="preserve">Validate date range input ensuring FROM date is not greater than TO date</w:t>
-      </w:r>
-    </w:p>
-    <w:p>
-      <w:pPr>
-        <w:pStyle w:val="ListParagraph"/>
-        <w:numPr>
-          <w:ilvl w:val="0"/>
-          <w:numId w:val="2"/>
-        </w:numPr>
-      </w:pPr>
-      <w:r>
-        <w:rPr>
-          <w:sz w:val="22"/>
-          <w:szCs w:val="22"/>
-          <w:rFonts w:ascii="Arial" w:cs="Arial" w:eastAsia="Arial" w:hAnsi="Arial"/>
-        </w:rPr>
-        <w:t xml:space="preserve">Provide timeout handling for long-running queries with progress indicator</w:t>
+        <w:t xml:space="preserve">Authorization failure displays standard SAP authorization error message and terminates report</w:t>
+      </w:r>
+    </w:p>
+    <w:p>
+      <w:pPr>
+        <w:pStyle w:val="ListParagraph"/>
+        <w:numPr>
+          <w:ilvl w:val="0"/>
+          <w:numId w:val="2"/>
+        </w:numPr>
+      </w:pPr>
+      <w:r>
+        <w:rPr>
+          <w:sz w:val="22"/>
+          <w:szCs w:val="22"/>
+          <w:rFonts w:ascii="Arial" w:cs="Arial" w:eastAsia="Arial" w:hAnsi="Arial"/>
+        </w:rPr>
+        <w:t xml:space="preserve">No data found scenario displays informational message 'No open items found for selection criteria'</w:t>
+      </w:r>
+    </w:p>
+    <w:p>
+      <w:pPr>
+        <w:pStyle w:val="ListParagraph"/>
+        <w:numPr>
+          <w:ilvl w:val="0"/>
+          <w:numId w:val="2"/>
+        </w:numPr>
+      </w:pPr>
+      <w:r>
+        <w:rPr>
+          <w:sz w:val="22"/>
+          <w:szCs w:val="22"/>
+          <w:rFonts w:ascii="Arial" w:cs="Arial" w:eastAsia="Arial" w:hAnsi="Arial"/>
+        </w:rPr>
+        <w:t xml:space="preserve">Database connection errors display technical error message with retry option</w:t>
+      </w:r>
+    </w:p>
+    <w:p>
+      <w:pPr>
+        <w:pStyle w:val="ListParagraph"/>
+        <w:numPr>
+          <w:ilvl w:val="0"/>
+          <w:numId w:val="2"/>
+        </w:numPr>
+      </w:pPr>
+      <w:r>
+        <w:rPr>
+          <w:sz w:val="22"/>
+          <w:szCs w:val="22"/>
+          <w:rFonts w:ascii="Arial" w:cs="Arial" w:eastAsia="Arial" w:hAnsi="Arial"/>
+        </w:rPr>
+        <w:t xml:space="preserve">Invalid date range (FROM &gt; TO) displays error message and highlights date fields</w:t>
+      </w:r>
+    </w:p>
+    <w:p>
+      <w:pPr>
+        <w:pStyle w:val="ListParagraph"/>
+        <w:numPr>
+          <w:ilvl w:val="0"/>
+          <w:numId w:val="2"/>
+        </w:numPr>
+      </w:pPr>
+      <w:r>
+        <w:rPr>
+          <w:sz w:val="22"/>
+          <w:szCs w:val="22"/>
+          <w:rFonts w:ascii="Arial" w:cs="Arial" w:eastAsia="Arial" w:hAnsi="Arial"/>
+        </w:rPr>
+        <w:t xml:space="preserve">Performance timeout after 300 seconds displays warning message and partial results</w:t>
+      </w:r>
+    </w:p>
+    <w:p>
+      <w:pPr>
+        <w:pStyle w:val="ListParagraph"/>
+        <w:numPr>
+          <w:ilvl w:val="0"/>
+          <w:numId w:val="2"/>
+        </w:numPr>
+      </w:pPr>
+      <w:r>
+        <w:rPr>
+          <w:sz w:val="22"/>
+          <w:szCs w:val="22"/>
+          <w:rFonts w:ascii="Arial" w:cs="Arial" w:eastAsia="Arial" w:hAnsi="Arial"/>
+        </w:rPr>
+        <w:t xml:space="preserve">Missing customer master data logs warning but continues processing with default text</w:t>
       </w:r>
     </w:p>
     <w:p>
@@ -2015,7 +1998,7 @@
           <w:szCs w:val="22"/>
           <w:rFonts w:ascii="Arial" w:cs="Arial" w:eastAsia="Arial" w:hAnsi="Arial"/>
         </w:rPr>
-        <w:t xml:space="preserve">Users must have authorization for F_BKPF_BUK (Accounting Document by Company Code) object with activity 03 (Display) for the specified company code. Standard roles SAP_FI_ACCOUNTING_PROFESSIONAL or equivalent custom roles containing this authorization object are required. No additional custom authorization objects are created for this development.</w:t>
+        <w:t xml:space="preserve">Users require authorization for authorization object F_BKPF_BUK (Accounting Document Authorization) with activity 03 (Display) for the specified company codes. Additionally, users need SAP_ALL or equivalent authorization for report execution (S_DEVELOP object) and ALV display functions. Finance functional roles should be configured to include ZFIN_OPEN_ITEMS in the appropriate role menu structure.</w:t>
       </w:r>
     </w:p>
     <w:p>
@@ -2043,7 +2026,7 @@
           <w:szCs w:val="22"/>
           <w:rFonts w:ascii="Arial" w:cs="Arial" w:eastAsia="Arial" w:hAnsi="Arial"/>
         </w:rPr>
-        <w:t xml:space="preserve">The report serves as an operational reporting tool for Finance department daily activities. No additional reporting layer integration is required. Users can export data using standard ALV export functionality to Excel or local files for further analysis. The report execution log is maintained through standard SAP job log mechanisms when run in background mode.</w:t>
+        <w:t xml:space="preserve">N/A - This development creates a report rather than consuming reporting services. The ALV Grid output serves as the reporting mechanism with standard export capabilities to Excel, XML, and other formats supported by SAP ALV framework.</w:t>
       </w:r>
     </w:p>
     <w:p>
@@ -2078,24 +2061,24 @@
           <w:szCs w:val="22"/>
           <w:rFonts w:ascii="Arial" w:cs="Arial" w:eastAsia="Arial" w:hAnsi="Arial"/>
         </w:rPr>
-        <w:t xml:space="preserve">Assumption: BSID table contains all required open customer line items in the target system</w:t>
-      </w:r>
-    </w:p>
-    <w:p>
-      <w:pPr>
-        <w:pStyle w:val="ListParagraph"/>
-        <w:numPr>
-          <w:ilvl w:val="0"/>
-          <w:numId w:val="2"/>
-        </w:numPr>
-      </w:pPr>
-      <w:r>
-        <w:rPr>
-          <w:sz w:val="22"/>
-          <w:szCs w:val="22"/>
-          <w:rFonts w:ascii="Arial" w:cs="Arial" w:eastAsia="Arial" w:hAnsi="Arial"/>
-        </w:rPr>
-        <w:t xml:space="preserve">Assumption: KNA1 customer master data is complete and current</w:t>
+        <w:t xml:space="preserve">Assumption: BSID table contains current fiscal year data - archive handling not required</w:t>
+      </w:r>
+    </w:p>
+    <w:p>
+      <w:pPr>
+        <w:pStyle w:val="ListParagraph"/>
+        <w:numPr>
+          <w:ilvl w:val="0"/>
+          <w:numId w:val="2"/>
+        </w:numPr>
+      </w:pPr>
+      <w:r>
+        <w:rPr>
+          <w:sz w:val="22"/>
+          <w:szCs w:val="22"/>
+          <w:rFonts w:ascii="Arial" w:cs="Arial" w:eastAsia="Arial" w:hAnsi="Arial"/>
+        </w:rPr>
+        <w:t xml:space="preserve">Assumption: Local currency amounts are sufficient - no foreign currency conversion needed</w:t>
       </w:r>
     </w:p>
     <w:p>
@@ -2129,41 +2112,41 @@
           <w:szCs w:val="22"/>
           <w:rFonts w:ascii="Arial" w:cs="Arial" w:eastAsia="Arial" w:hAnsi="Arial"/>
         </w:rPr>
-        <w:t xml:space="preserve">Dependency: ALV function group SALV must be available in the target system</w:t>
-      </w:r>
-    </w:p>
-    <w:p>
-      <w:pPr>
-        <w:pStyle w:val="ListParagraph"/>
-        <w:numPr>
-          <w:ilvl w:val="0"/>
-          <w:numId w:val="2"/>
-        </w:numPr>
-      </w:pPr>
-      <w:r>
-        <w:rPr>
-          <w:sz w:val="22"/>
-          <w:szCs w:val="22"/>
-          <w:rFonts w:ascii="Arial" w:cs="Arial" w:eastAsia="Arial" w:hAnsi="Arial"/>
-        </w:rPr>
-        <w:t xml:space="preserve">Open Item: Confirmation needed on specific currency display format requirements</w:t>
-      </w:r>
-    </w:p>
-    <w:p>
-      <w:pPr>
-        <w:pStyle w:val="ListParagraph"/>
-        <w:numPr>
-          <w:ilvl w:val="0"/>
-          <w:numId w:val="2"/>
-        </w:numPr>
-      </w:pPr>
-      <w:r>
-        <w:rPr>
-          <w:sz w:val="22"/>
-          <w:szCs w:val="22"/>
-          <w:rFonts w:ascii="Arial" w:cs="Arial" w:eastAsia="Arial" w:hAnsi="Arial"/>
-        </w:rPr>
-        <w:t xml:space="preserve">Open Item: Business decision required on maximum number of records to display without pagination</w:t>
+        <w:t xml:space="preserve">Dependency: KNA1 and BSID table access must be available in target system</w:t>
+      </w:r>
+    </w:p>
+    <w:p>
+      <w:pPr>
+        <w:pStyle w:val="ListParagraph"/>
+        <w:numPr>
+          <w:ilvl w:val="0"/>
+          <w:numId w:val="2"/>
+        </w:numPr>
+      </w:pPr>
+      <w:r>
+        <w:rPr>
+          <w:sz w:val="22"/>
+          <w:szCs w:val="22"/>
+          <w:rFonts w:ascii="Arial" w:cs="Arial" w:eastAsia="Arial" w:hAnsi="Arial"/>
+        </w:rPr>
+        <w:t xml:space="preserve">Open Item: Performance testing required for systems with large data volumes</w:t>
+      </w:r>
+    </w:p>
+    <w:p>
+      <w:pPr>
+        <w:pStyle w:val="ListParagraph"/>
+        <w:numPr>
+          <w:ilvl w:val="0"/>
+          <w:numId w:val="2"/>
+        </w:numPr>
+      </w:pPr>
+      <w:r>
+        <w:rPr>
+          <w:sz w:val="22"/>
+          <w:szCs w:val="22"/>
+          <w:rFonts w:ascii="Arial" w:cs="Arial" w:eastAsia="Arial" w:hAnsi="Arial"/>
+        </w:rPr>
+        <w:t xml:space="preserve">Open Item: User training materials and documentation to be provided separately</w:t>
       </w:r>
     </w:p>
     <w:p>

</xml_diff>

<commit_message>
CPI-4: Add Solution Overview step with Clean Core A-D compliance assessment, Level D blocking, Level C justification gate, visual Level 2/3 architecture diagrams, SO alignment in TDS
</commit_message>
<xml_diff>
--- a/output/ZFIN_OPEN_ITEMS___Finance_Open_Items_Report_FDS_v1_0.docx
+++ b/output/ZFIN_OPEN_ITEMS___Finance_Open_Items_Report_FDS_v1_0.docx
@@ -340,7 +340,7 @@
                 <w:szCs w:val="20"/>
                 <w:rFonts w:ascii="Arial" w:cs="Arial" w:eastAsia="Arial" w:hAnsi="Arial"/>
               </w:rPr>
-              <w:t xml:space="preserve">May 6, 2026</w:t>
+              <w:t xml:space="preserve">May 11, 2026</w:t>
             </w:r>
           </w:p>
         </w:tc>
@@ -545,7 +545,7 @@
           <w:szCs w:val="22"/>
           <w:rFonts w:ascii="Arial" w:cs="Arial" w:eastAsia="Arial" w:hAnsi="Arial"/>
         </w:rPr>
-        <w:t xml:space="preserve">The Finance team requires a dedicated report to analyze open customer line items for cash flow management and collection activities. Currently, users must navigate through multiple standard SAP transactions to gather this information, leading to inefficiencies in the accounts receivable process. This custom report consolidates open item data with customer information in a single, user-friendly interface.</w:t>
+        <w:t xml:space="preserve">The Finance department currently faces significant challenges in monitoring customer receivables and cash flow management due to the lack of a consolidated view of open customer line items. Finance users must navigate between multiple SAP transactions (FBL5N, KNA1) to gather comprehensive information about outstanding customer balances, leading to inefficient processes and potential oversight of overdue payments. This custom ABAP report ZFIN_OPEN_ITEMS addresses the business requirement to provide a unified, filtered view of open customer line items with enhanced reporting capabilities. The development will directly impact the Accounts Receivable team, Credit Management department, and Finance Controllers who require real-time visibility into customer payment statuses for effective cash flow forecasting and collection activities. The business value includes reduced manual effort in data compilation, improved accuracy in receivables reporting, and enhanced decision-making capabilities for credit limit assessments and collection prioritization.</w:t>
       </w:r>
     </w:p>
     <w:p>
@@ -593,92 +593,126 @@
           <w:szCs w:val="22"/>
           <w:rFonts w:ascii="Arial" w:cs="Arial" w:eastAsia="Arial" w:hAnsi="Arial"/>
         </w:rPr>
-        <w:t xml:space="preserve">Display open customer line items from BSID table</w:t>
-      </w:r>
-    </w:p>
-    <w:p>
-      <w:pPr>
-        <w:pStyle w:val="ListParagraph"/>
-        <w:numPr>
-          <w:ilvl w:val="0"/>
-          <w:numId w:val="2"/>
-        </w:numPr>
-      </w:pPr>
-      <w:r>
-        <w:rPr>
-          <w:sz w:val="22"/>
-          <w:szCs w:val="22"/>
-          <w:rFonts w:ascii="Arial" w:cs="Arial" w:eastAsia="Arial" w:hAnsi="Arial"/>
-        </w:rPr>
-        <w:t xml:space="preserve">Customer master data integration from KNA1</w:t>
-      </w:r>
-    </w:p>
-    <w:p>
-      <w:pPr>
-        <w:pStyle w:val="ListParagraph"/>
-        <w:numPr>
-          <w:ilvl w:val="0"/>
-          <w:numId w:val="2"/>
-        </w:numPr>
-      </w:pPr>
-      <w:r>
-        <w:rPr>
-          <w:sz w:val="22"/>
-          <w:szCs w:val="22"/>
-          <w:rFonts w:ascii="Arial" w:cs="Arial" w:eastAsia="Arial" w:hAnsi="Arial"/>
-        </w:rPr>
-        <w:t xml:space="preserve">Filtering by company code and posting date range</w:t>
-      </w:r>
-    </w:p>
-    <w:p>
-      <w:pPr>
-        <w:pStyle w:val="ListParagraph"/>
-        <w:numPr>
-          <w:ilvl w:val="0"/>
-          <w:numId w:val="2"/>
-        </w:numPr>
-      </w:pPr>
-      <w:r>
-        <w:rPr>
-          <w:sz w:val="22"/>
-          <w:szCs w:val="22"/>
-          <w:rFonts w:ascii="Arial" w:cs="Arial" w:eastAsia="Arial" w:hAnsi="Arial"/>
-        </w:rPr>
-        <w:t xml:space="preserve">ALV Grid display with standard ALV functions</w:t>
-      </w:r>
-    </w:p>
-    <w:p>
-      <w:pPr>
-        <w:pStyle w:val="ListParagraph"/>
-        <w:numPr>
-          <w:ilvl w:val="0"/>
-          <w:numId w:val="2"/>
-        </w:numPr>
-      </w:pPr>
-      <w:r>
-        <w:rPr>
-          <w:sz w:val="22"/>
-          <w:szCs w:val="22"/>
-          <w:rFonts w:ascii="Arial" w:cs="Arial" w:eastAsia="Arial" w:hAnsi="Arial"/>
-        </w:rPr>
-        <w:t xml:space="preserve">Authorization check for F_BKPF_BUK object</w:t>
-      </w:r>
-    </w:p>
-    <w:p>
-      <w:pPr>
-        <w:pStyle w:val="ListParagraph"/>
-        <w:numPr>
-          <w:ilvl w:val="0"/>
-          <w:numId w:val="2"/>
-        </w:numPr>
-      </w:pPr>
-      <w:r>
-        <w:rPr>
-          <w:sz w:val="22"/>
-          <w:szCs w:val="22"/>
-          <w:rFonts w:ascii="Arial" w:cs="Arial" w:eastAsia="Arial" w:hAnsi="Arial"/>
-        </w:rPr>
-        <w:t xml:space="preserve">Display of customer number, name, document number, posting date, amount, and due date</w:t>
+        <w:t xml:space="preserve">Custom ABAP report ZFIN_OPEN_ITEMS creation in package ZFINANCE with ALV Grid output functionality</w:t>
+      </w:r>
+    </w:p>
+    <w:p>
+      <w:pPr>
+        <w:pStyle w:val="ListParagraph"/>
+        <w:numPr>
+          <w:ilvl w:val="0"/>
+          <w:numId w:val="2"/>
+        </w:numPr>
+      </w:pPr>
+      <w:r>
+        <w:rPr>
+          <w:sz w:val="22"/>
+          <w:szCs w:val="22"/>
+          <w:rFonts w:ascii="Arial" w:cs="Arial" w:eastAsia="Arial" w:hAnsi="Arial"/>
+        </w:rPr>
+        <w:t xml:space="preserve">Integration with customer master data table KNA1 for customer name retrieval and validation</w:t>
+      </w:r>
+    </w:p>
+    <w:p>
+      <w:pPr>
+        <w:pStyle w:val="ListParagraph"/>
+        <w:numPr>
+          <w:ilvl w:val="0"/>
+          <w:numId w:val="2"/>
+        </w:numPr>
+      </w:pPr>
+      <w:r>
+        <w:rPr>
+          <w:sz w:val="22"/>
+          <w:szCs w:val="22"/>
+          <w:rFonts w:ascii="Arial" w:cs="Arial" w:eastAsia="Arial" w:hAnsi="Arial"/>
+        </w:rPr>
+        <w:t xml:space="preserve">Access to customer line items table BSID for open item information extraction and processing</w:t>
+      </w:r>
+    </w:p>
+    <w:p>
+      <w:pPr>
+        <w:pStyle w:val="ListParagraph"/>
+        <w:numPr>
+          <w:ilvl w:val="0"/>
+          <w:numId w:val="2"/>
+        </w:numPr>
+      </w:pPr>
+      <w:r>
+        <w:rPr>
+          <w:sz w:val="22"/>
+          <w:szCs w:val="22"/>
+          <w:rFonts w:ascii="Arial" w:cs="Arial" w:eastAsia="Arial" w:hAnsi="Arial"/>
+        </w:rPr>
+        <w:t xml:space="preserve">Selection screen implementation with company code (BUKRS) and posting date range (BUDAT) input parameters</w:t>
+      </w:r>
+    </w:p>
+    <w:p>
+      <w:pPr>
+        <w:pStyle w:val="ListParagraph"/>
+        <w:numPr>
+          <w:ilvl w:val="0"/>
+          <w:numId w:val="2"/>
+        </w:numPr>
+      </w:pPr>
+      <w:r>
+        <w:rPr>
+          <w:sz w:val="22"/>
+          <w:szCs w:val="22"/>
+          <w:rFonts w:ascii="Arial" w:cs="Arial" w:eastAsia="Arial" w:hAnsi="Arial"/>
+        </w:rPr>
+        <w:t xml:space="preserve">Authorization verification using SAP authorization object F_BKPF_BUK for company code access control</w:t>
+      </w:r>
+    </w:p>
+    <w:p>
+      <w:pPr>
+        <w:pStyle w:val="ListParagraph"/>
+        <w:numPr>
+          <w:ilvl w:val="0"/>
+          <w:numId w:val="2"/>
+        </w:numPr>
+      </w:pPr>
+      <w:r>
+        <w:rPr>
+          <w:sz w:val="22"/>
+          <w:szCs w:val="22"/>
+          <w:rFonts w:ascii="Arial" w:cs="Arial" w:eastAsia="Arial" w:hAnsi="Arial"/>
+        </w:rPr>
+        <w:t xml:space="preserve">ALV Grid display configuration with customer number, customer name, document number, posting date, local currency amount, and due date columns</w:t>
+      </w:r>
+    </w:p>
+    <w:p>
+      <w:pPr>
+        <w:pStyle w:val="ListParagraph"/>
+        <w:numPr>
+          <w:ilvl w:val="0"/>
+          <w:numId w:val="2"/>
+        </w:numPr>
+      </w:pPr>
+      <w:r>
+        <w:rPr>
+          <w:sz w:val="22"/>
+          <w:szCs w:val="22"/>
+          <w:rFonts w:ascii="Arial" w:cs="Arial" w:eastAsia="Arial" w:hAnsi="Arial"/>
+        </w:rPr>
+        <w:t xml:space="preserve">Export functionality to Excel format through standard ALV Grid capabilities for further analysis</w:t>
+      </w:r>
+    </w:p>
+    <w:p>
+      <w:pPr>
+        <w:pStyle w:val="ListParagraph"/>
+        <w:numPr>
+          <w:ilvl w:val="0"/>
+          <w:numId w:val="2"/>
+        </w:numPr>
+      </w:pPr>
+      <w:r>
+        <w:rPr>
+          <w:sz w:val="22"/>
+          <w:szCs w:val="22"/>
+          <w:rFonts w:ascii="Arial" w:cs="Arial" w:eastAsia="Arial" w:hAnsi="Arial"/>
+        </w:rPr>
+        <w:t xml:space="preserve">Error handling implementation for invalid company codes, date ranges, and authorization failures</w:t>
       </w:r>
     </w:p>
     <w:p>
@@ -708,109 +742,58 @@
           <w:szCs w:val="22"/>
           <w:rFonts w:ascii="Arial" w:cs="Arial" w:eastAsia="Arial" w:hAnsi="Arial"/>
         </w:rPr>
-        <w:t xml:space="preserve">Line item modification or deletion capabilities</w:t>
-      </w:r>
-    </w:p>
-    <w:p>
-      <w:pPr>
-        <w:pStyle w:val="ListParagraph"/>
-        <w:numPr>
-          <w:ilvl w:val="0"/>
-          <w:numId w:val="2"/>
-        </w:numPr>
-      </w:pPr>
-      <w:r>
-        <w:rPr>
-          <w:sz w:val="22"/>
-          <w:szCs w:val="22"/>
-          <w:rFonts w:ascii="Arial" w:cs="Arial" w:eastAsia="Arial" w:hAnsi="Arial"/>
-        </w:rPr>
-        <w:t xml:space="preserve">Integration with third-party systems</w:t>
-      </w:r>
-    </w:p>
-    <w:p>
-      <w:pPr>
-        <w:pStyle w:val="ListParagraph"/>
-        <w:numPr>
-          <w:ilvl w:val="0"/>
-          <w:numId w:val="2"/>
-        </w:numPr>
-      </w:pPr>
-      <w:r>
-        <w:rPr>
-          <w:sz w:val="22"/>
-          <w:szCs w:val="22"/>
-          <w:rFonts w:ascii="Arial" w:cs="Arial" w:eastAsia="Arial" w:hAnsi="Arial"/>
-        </w:rPr>
-        <w:t xml:space="preserve">Email or print functionality</w:t>
-      </w:r>
-    </w:p>
-    <w:p>
-      <w:pPr>
-        <w:pStyle w:val="ListParagraph"/>
-        <w:numPr>
-          <w:ilvl w:val="0"/>
-          <w:numId w:val="2"/>
-        </w:numPr>
-      </w:pPr>
-      <w:r>
-        <w:rPr>
-          <w:sz w:val="22"/>
-          <w:szCs w:val="22"/>
-          <w:rFonts w:ascii="Arial" w:cs="Arial" w:eastAsia="Arial" w:hAnsi="Arial"/>
-        </w:rPr>
-        <w:t xml:space="preserve">Vendor open items (AP functionality)</w:t>
-      </w:r>
-    </w:p>
-    <w:p>
-      <w:pPr>
-        <w:pStyle w:val="ListParagraph"/>
-        <w:numPr>
-          <w:ilvl w:val="0"/>
-          <w:numId w:val="2"/>
-        </w:numPr>
-      </w:pPr>
-      <w:r>
-        <w:rPr>
-          <w:sz w:val="22"/>
-          <w:szCs w:val="22"/>
-          <w:rFonts w:ascii="Arial" w:cs="Arial" w:eastAsia="Arial" w:hAnsi="Arial"/>
-        </w:rPr>
-        <w:t xml:space="preserve">Cleared line items display</w:t>
-      </w:r>
-    </w:p>
-    <w:p>
-      <w:pPr>
-        <w:pStyle w:val="ListParagraph"/>
-        <w:numPr>
-          <w:ilvl w:val="0"/>
-          <w:numId w:val="2"/>
-        </w:numPr>
-      </w:pPr>
-      <w:r>
-        <w:rPr>
-          <w:sz w:val="22"/>
-          <w:szCs w:val="22"/>
-          <w:rFonts w:ascii="Arial" w:cs="Arial" w:eastAsia="Arial" w:hAnsi="Arial"/>
-        </w:rPr>
-        <w:t xml:space="preserve">Multi-currency conversion beyond local currency</w:t>
-      </w:r>
-    </w:p>
-    <w:p>
-      <w:pPr>
-        <w:pStyle w:val="ListParagraph"/>
-        <w:numPr>
-          <w:ilvl w:val="0"/>
-          <w:numId w:val="2"/>
-        </w:numPr>
-      </w:pPr>
-      <w:r>
-        <w:rPr>
-          <w:sz w:val="22"/>
-          <w:szCs w:val="22"/>
-          <w:rFonts w:ascii="Arial" w:cs="Arial" w:eastAsia="Arial" w:hAnsi="Arial"/>
-        </w:rPr>
-        <w:t xml:space="preserve">Dunning level information</w:t>
+        <w:t xml:space="preserve">Modification of existing SAP standard tables KNA1, BSID, or any other Financial Accounting tables</w:t>
+      </w:r>
+    </w:p>
+    <w:p>
+      <w:pPr>
+        <w:pStyle w:val="ListParagraph"/>
+        <w:numPr>
+          <w:ilvl w:val="0"/>
+          <w:numId w:val="2"/>
+        </w:numPr>
+      </w:pPr>
+      <w:r>
+        <w:rPr>
+          <w:sz w:val="22"/>
+          <w:szCs w:val="22"/>
+          <w:rFonts w:ascii="Arial" w:cs="Arial" w:eastAsia="Arial" w:hAnsi="Arial"/>
+        </w:rPr>
+        <w:t xml:space="preserve">Integration with external systems or third-party applications for data exchange or synchronization</w:t>
+      </w:r>
+    </w:p>
+    <w:p>
+      <w:pPr>
+        <w:pStyle w:val="ListParagraph"/>
+        <w:numPr>
+          <w:ilvl w:val="0"/>
+          <w:numId w:val="2"/>
+        </w:numPr>
+      </w:pPr>
+      <w:r>
+        <w:rPr>
+          <w:sz w:val="22"/>
+          <w:szCs w:val="22"/>
+          <w:rFonts w:ascii="Arial" w:cs="Arial" w:eastAsia="Arial" w:hAnsi="Arial"/>
+        </w:rPr>
+        <w:t xml:space="preserve">Real-time data updates or background job scheduling for automated report generation</w:t>
+      </w:r>
+    </w:p>
+    <w:p>
+      <w:pPr>
+        <w:pStyle w:val="ListParagraph"/>
+        <w:numPr>
+          <w:ilvl w:val="0"/>
+          <w:numId w:val="2"/>
+        </w:numPr>
+      </w:pPr>
+      <w:r>
+        <w:rPr>
+          <w:sz w:val="22"/>
+          <w:szCs w:val="22"/>
+          <w:rFonts w:ascii="Arial" w:cs="Arial" w:eastAsia="Arial" w:hAnsi="Arial"/>
+        </w:rPr>
+        <w:t xml:space="preserve">Customization of SAP standard authorization objects or creation of new authorization objects beyond F_BKPF_BUK</w:t>
       </w:r>
     </w:p>
     <w:p>
@@ -838,7 +821,7 @@
           <w:szCs w:val="22"/>
           <w:rFonts w:ascii="Arial" w:cs="Arial" w:eastAsia="Arial" w:hAnsi="Arial"/>
         </w:rPr>
-        <w:t xml:space="preserve">Finance users access the ZFIN_OPEN_ITEMS report through transaction SE38 or via custom menu. Users input selection criteria including mandatory company code and optional posting date range. The system validates user authorization for the specified company code(s) using F_BKPF_BUK authorization object. Upon successful authorization, the system retrieves open line items from BSID table and enriches data with customer names from KNA1 table. Results display in ALV Grid format with standard sorting, filtering, and export capabilities.</w:t>
+        <w:t xml:space="preserve">The business process begins when Finance users execute the custom report ZFIN_OPEN_ITEMS through transaction SE38 or a custom transaction code to analyze customer receivables for specific company codes and time periods. Users input mandatory selection criteria including company code (BUKRS) from their authorized scope and optional posting date range (BUDAT) to filter relevant open items. The system validates user authorization against object F_BKPF_BUK to ensure appropriate company code access before proceeding with data retrieval. Upon successful authorization, the system queries customer master data from table KNA1 to obtain customer names and account information, then retrieves corresponding open line items from table BSID based on the specified selection criteria. The system performs data consolidation and formatting to prepare the output dataset with customer details, document information, amounts in local currency, and calculated due dates. The final step presents the consolidated information through an interactive ALV Grid interface, enabling users to sort, filter, and export data to Excel format for further analysis in credit management processes, cash flow forecasting, and collection activities. This streamlined process eliminates the need for Finance users to manually navigate between multiple SAP transactions such as FBL5N for line item analysis and KNA1 for customer master data verification.</w:t>
       </w:r>
     </w:p>
     <w:p>
@@ -996,7 +979,7 @@
                 <w:szCs w:val="20"/>
                 <w:rFonts w:ascii="Arial" w:cs="Arial" w:eastAsia="Arial" w:hAnsi="Arial"/>
               </w:rPr>
-              <w:t xml:space="preserve">FR01</w:t>
+              <w:t xml:space="preserve">REQ_001</w:t>
             </w:r>
           </w:p>
         </w:tc>
@@ -1024,7 +1007,7 @@
                 <w:szCs w:val="20"/>
                 <w:rFonts w:ascii="Arial" w:cs="Arial" w:eastAsia="Arial" w:hAnsi="Arial"/>
               </w:rPr>
-              <w:t xml:space="preserve">Report must display only open line items where BSID-AUGBL is initial</w:t>
+              <w:t xml:space="preserve">The system shall provide a selection screen with mandatory company code field (BUKRS) referencing table T001-BUKRS with input validation against user authorization object F_BKPF_BUK. Acceptance criteria: System displays error message when unauthorized company code is entered and prevents report execution.</w:t>
             </w:r>
           </w:p>
         </w:tc>
@@ -1082,7 +1065,7 @@
                 <w:szCs w:val="20"/>
                 <w:rFonts w:ascii="Arial" w:cs="Arial" w:eastAsia="Arial" w:hAnsi="Arial"/>
               </w:rPr>
-              <w:t xml:space="preserve">FR02</w:t>
+              <w:t xml:space="preserve">REQ_002</w:t>
             </w:r>
           </w:p>
         </w:tc>
@@ -1110,7 +1093,7 @@
                 <w:szCs w:val="20"/>
                 <w:rFonts w:ascii="Arial" w:cs="Arial" w:eastAsia="Arial" w:hAnsi="Arial"/>
               </w:rPr>
-              <w:t xml:space="preserve">Selection screen must include mandatory company code parameter</w:t>
+              <w:t xml:space="preserve">The system shall implement optional posting date range selection using fields BUDAT-LOW and BUDAT-HIGH referencing BSID-BUDAT for filtering open customer line items. Acceptance criteria: System accepts valid date formats and validates FROM date is not greater than TO date with appropriate error messaging.</w:t>
             </w:r>
           </w:p>
         </w:tc>
@@ -1168,7 +1151,7 @@
                 <w:szCs w:val="20"/>
                 <w:rFonts w:ascii="Arial" w:cs="Arial" w:eastAsia="Arial" w:hAnsi="Arial"/>
               </w:rPr>
-              <w:t xml:space="preserve">FR03</w:t>
+              <w:t xml:space="preserve">REQ_003</w:t>
             </w:r>
           </w:p>
         </w:tc>
@@ -1196,7 +1179,7 @@
                 <w:szCs w:val="20"/>
                 <w:rFonts w:ascii="Arial" w:cs="Arial" w:eastAsia="Arial" w:hAnsi="Arial"/>
               </w:rPr>
-              <w:t xml:space="preserve">Selection screen must include optional posting date range parameters</w:t>
+              <w:t xml:space="preserve">The system shall retrieve customer master data from table KNA1 using fields KUNNR and NAME1 to display customer number and customer name in the output. Acceptance criteria: System displays customer information for all valid customer numbers found in BSID records, handling cases where customer master data may be missing.</w:t>
             </w:r>
           </w:p>
         </w:tc>
@@ -1224,7 +1207,7 @@
                 <w:szCs w:val="20"/>
                 <w:rFonts w:ascii="Arial" w:cs="Arial" w:eastAsia="Arial" w:hAnsi="Arial"/>
               </w:rPr>
-              <w:t xml:space="preserve">Medium</w:t>
+              <w:t xml:space="preserve">High</w:t>
             </w:r>
           </w:p>
         </w:tc>
@@ -1254,7 +1237,7 @@
                 <w:szCs w:val="20"/>
                 <w:rFonts w:ascii="Arial" w:cs="Arial" w:eastAsia="Arial" w:hAnsi="Arial"/>
               </w:rPr>
-              <w:t xml:space="preserve">FR04</w:t>
+              <w:t xml:space="preserve">REQ_004</w:t>
             </w:r>
           </w:p>
         </w:tc>
@@ -1282,7 +1265,7 @@
                 <w:szCs w:val="20"/>
                 <w:rFonts w:ascii="Arial" w:cs="Arial" w:eastAsia="Arial" w:hAnsi="Arial"/>
               </w:rPr>
-              <w:t xml:space="preserve">System must perform authorization check for F_BKPF_BUK before data retrieval</w:t>
+              <w:t xml:space="preserve">The system shall extract open customer line items from table BSID using fields BUKRS, KUNNR, BELNR, BUDAT, DMBTR, and ZFBDT where AUSGL is initial. Acceptance criteria: System displays only uncleared line items with local currency amounts and calculates due dates based on payment terms.</w:t>
             </w:r>
           </w:p>
         </w:tc>
@@ -1340,7 +1323,7 @@
                 <w:szCs w:val="20"/>
                 <w:rFonts w:ascii="Arial" w:cs="Arial" w:eastAsia="Arial" w:hAnsi="Arial"/>
               </w:rPr>
-              <w:t xml:space="preserve">FR05</w:t>
+              <w:t xml:space="preserve">REQ_005</w:t>
             </w:r>
           </w:p>
         </w:tc>
@@ -1368,7 +1351,7 @@
                 <w:szCs w:val="20"/>
                 <w:rFonts w:ascii="Arial" w:cs="Arial" w:eastAsia="Arial" w:hAnsi="Arial"/>
               </w:rPr>
-              <w:t xml:space="preserve">Report output must display customer number, customer name, document number, posting date, amount in local currency, and due date</w:t>
+              <w:t xml:space="preserve">The system shall display data in ALV Grid format with sortable and filterable columns including customer number (KUNNR), customer name (NAME1), document number (BELNR), posting date (BUDAT), amount in local currency (DMBTR), and due date (ZFBDT). Acceptance criteria: ALV Grid loads within 5 seconds for up to 10,000 records with full interactive functionality.</w:t>
             </w:r>
           </w:p>
         </w:tc>
@@ -1426,7 +1409,7 @@
                 <w:szCs w:val="20"/>
                 <w:rFonts w:ascii="Arial" w:cs="Arial" w:eastAsia="Arial" w:hAnsi="Arial"/>
               </w:rPr>
-              <w:t xml:space="preserve">FR06</w:t>
+              <w:t xml:space="preserve">REQ_006</w:t>
             </w:r>
           </w:p>
         </w:tc>
@@ -1454,7 +1437,7 @@
                 <w:szCs w:val="20"/>
                 <w:rFonts w:ascii="Arial" w:cs="Arial" w:eastAsia="Arial" w:hAnsi="Arial"/>
               </w:rPr>
-              <w:t xml:space="preserve">Output must be presented using ALV Grid with standard ALV functionality</w:t>
+              <w:t xml:space="preserve">The system shall implement authorization check using object F_BKPF_BUK with activity 03 (display) for the specified company code before data retrieval. Acceptance criteria: System denies access with message 'No authorization for company code &amp;1' when user lacks appropriate authorization.</w:t>
             </w:r>
           </w:p>
         </w:tc>
@@ -1512,7 +1495,7 @@
                 <w:szCs w:val="20"/>
                 <w:rFonts w:ascii="Arial" w:cs="Arial" w:eastAsia="Arial" w:hAnsi="Arial"/>
               </w:rPr>
-              <w:t xml:space="preserve">FR07</w:t>
+              <w:t xml:space="preserve">REQ_007</w:t>
             </w:r>
           </w:p>
         </w:tc>
@@ -1540,7 +1523,7 @@
                 <w:szCs w:val="20"/>
                 <w:rFonts w:ascii="Arial" w:cs="Arial" w:eastAsia="Arial" w:hAnsi="Arial"/>
               </w:rPr>
-              <w:t xml:space="preserve">Customer name must be retrieved from KNA1 table based on customer number</w:t>
+              <w:t xml:space="preserve">The system shall provide export functionality to Excel format through standard ALV Grid export options for further analysis and reporting purposes. Acceptance criteria: Export function generates Excel file with all displayed columns and data formatting preserved.</w:t>
             </w:r>
           </w:p>
         </w:tc>
@@ -1598,7 +1581,7 @@
                 <w:szCs w:val="20"/>
                 <w:rFonts w:ascii="Arial" w:cs="Arial" w:eastAsia="Arial" w:hAnsi="Arial"/>
               </w:rPr>
-              <w:t xml:space="preserve">FR08</w:t>
+              <w:t xml:space="preserve">REQ_008</w:t>
             </w:r>
           </w:p>
         </w:tc>
@@ -1626,7 +1609,7 @@
                 <w:szCs w:val="20"/>
                 <w:rFonts w:ascii="Arial" w:cs="Arial" w:eastAsia="Arial" w:hAnsi="Arial"/>
               </w:rPr>
-              <w:t xml:space="preserve">Report must handle cases where customer master data is not found</w:t>
+              <w:t xml:space="preserve">The system shall handle scenarios where no data is found for the specified selection criteria by displaying informational message 'No open items found for specified criteria'. Acceptance criteria: System displays empty ALV Grid with appropriate message rather than error termination.</w:t>
             </w:r>
           </w:p>
         </w:tc>
@@ -1685,7 +1668,7 @@
           <w:szCs w:val="22"/>
           <w:rFonts w:ascii="Arial" w:cs="Arial" w:eastAsia="Arial" w:hAnsi="Arial"/>
         </w:rPr>
-        <w:t xml:space="preserve">Selection screen contains Company Code field (mandatory, BUKRS type) and Posting Date range fields (optional, BUDAT type with FROM/TO parameters). ALV Grid displays tabular output with columns: Customer Number (KUNNR), Customer Name (NAME1), Document Number (BELNR), Posting Date (BUDAT), Amount in Local Currency (DMBTR), and Due Date (NETDT). Standard ALV toolbar provides sort, filter, sum, and export functions.</w:t>
+        <w:t xml:space="preserve">The selection screen shall contain a mandatory input field for Company Code (parameter BUKRS with data element BUKRS, length 4) displayed as a single-value input with F4 help from table T001. The posting date range shall be implemented using SELECT-OPTIONS field SO_BUDAT for field BSID-BUDAT with optional input allowing FROM and TO date specification. The ALV Grid output shall display six columns: Customer Number (KUNNR, 10 characters, left-aligned), Customer Name (NAME1, 35 characters, left-aligned), Document Number (BELNR, 10 characters, left-aligned), Posting Date (BUDAT, 10 characters, center-aligned with DD.MM.YYYY format), Amount in Local Currency (DMBTR, 15 characters, right-aligned with currency formatting), and Due Date (ZFBDT, 10 characters, center-aligned with DD.MM.YYYY format). The ALV Grid shall include standard toolbar with sort, filter, and export functionalities enabled. Column headers shall display descriptive text: 'Customer Number', 'Customer Name', 'Document Number', 'Posting Date', 'Amount (LC)', and 'Due Date' respectively.</w:t>
       </w:r>
     </w:p>
     <w:p>
@@ -1713,7 +1696,7 @@
           <w:szCs w:val="22"/>
           <w:rFonts w:ascii="Arial" w:cs="Arial" w:eastAsia="Arial" w:hAnsi="Arial"/>
         </w:rPr>
-        <w:t xml:space="preserve">Input: Company Code (BUKRS - mandatory), Posting Date From (BUDAT - optional), Posting Date To (BUDAT - optional). Data Sources: BSID (Customer Line Items), KNA1 (Customer Master). Output Fields: Customer Number (BSID-KUNNR), Customer Name (KNA1-NAME1), Document Number (BSID-BELNR), Posting Date (BSID-BUDAT), Amount Local Currency (BSID-DMBTR), Due Date (BSID-NETDT). Output Format: ALV Grid with approximately 1000-5000 records per execution depending on selection criteria.</w:t>
+        <w:t xml:space="preserve">Input specifications: Company Code field BUKRS (mandatory) sourced from table T001, data type CHAR, length 4, with domain BUKRS and input validation against user authorizations. Posting Date Range SO_BUDAT (optional) referencing field BSID-BUDAT, data type DATS, length 8, allowing date range selection with format DD.MM.YYYY. Output specifications: Customer Number from KNA1-KUNNR, data type CHAR, length 10, display format left-aligned. Customer Name from KNA1-NAME1, data type CHAR, length 35, display format left-aligned with text formatting. Document Number from BSID-BELNR, data type CHAR, length 10, display format left-aligned. Posting Date from BSID-BUDAT, data type DATS, length 8, display format DD.MM.YYYY center-aligned. Amount in Local Currency from BSID-DMBTR, data type CURR, length 13 with 2 decimal places, display format right-aligned with thousands separator and currency symbol. Due Date from BSID-ZFBDT, data type DATS, length 8, display format DD.MM.YYYY center-aligned. All output fields shall maintain original SAP data dictionary properties and formatting rules.</w:t>
       </w:r>
     </w:p>
     <w:p>
@@ -1748,109 +1731,126 @@
           <w:szCs w:val="22"/>
           <w:rFonts w:ascii="Arial" w:cs="Arial" w:eastAsia="Arial" w:hAnsi="Arial"/>
         </w:rPr>
-        <w:t xml:space="preserve">Only open line items where clearing document (AUGBL) is initial are displayed</w:t>
-      </w:r>
-    </w:p>
-    <w:p>
-      <w:pPr>
-        <w:pStyle w:val="ListParagraph"/>
-        <w:numPr>
-          <w:ilvl w:val="0"/>
-          <w:numId w:val="2"/>
-        </w:numPr>
-      </w:pPr>
-      <w:r>
-        <w:rPr>
-          <w:sz w:val="22"/>
-          <w:szCs w:val="22"/>
-          <w:rFonts w:ascii="Arial" w:cs="Arial" w:eastAsia="Arial" w:hAnsi="Arial"/>
-        </w:rPr>
-        <w:t xml:space="preserve">Authorization check for F_BKPF_BUK must pass for each company code in selection</w:t>
-      </w:r>
-    </w:p>
-    <w:p>
-      <w:pPr>
-        <w:pStyle w:val="ListParagraph"/>
-        <w:numPr>
-          <w:ilvl w:val="0"/>
-          <w:numId w:val="2"/>
-        </w:numPr>
-      </w:pPr>
-      <w:r>
-        <w:rPr>
-          <w:sz w:val="22"/>
-          <w:szCs w:val="22"/>
-          <w:rFonts w:ascii="Arial" w:cs="Arial" w:eastAsia="Arial" w:hAnsi="Arial"/>
-        </w:rPr>
-        <w:t xml:space="preserve">If posting date range is provided, both FROM and TO dates must be populated</w:t>
-      </w:r>
-    </w:p>
-    <w:p>
-      <w:pPr>
-        <w:pStyle w:val="ListParagraph"/>
-        <w:numPr>
-          <w:ilvl w:val="0"/>
-          <w:numId w:val="2"/>
-        </w:numPr>
-      </w:pPr>
-      <w:r>
-        <w:rPr>
-          <w:sz w:val="22"/>
-          <w:szCs w:val="22"/>
-          <w:rFonts w:ascii="Arial" w:cs="Arial" w:eastAsia="Arial" w:hAnsi="Arial"/>
-        </w:rPr>
-        <w:t xml:space="preserve">Customer name defaults to 'NOT FOUND' if customer number does not exist in KNA1</w:t>
-      </w:r>
-    </w:p>
-    <w:p>
-      <w:pPr>
-        <w:pStyle w:val="ListParagraph"/>
-        <w:numPr>
-          <w:ilvl w:val="0"/>
-          <w:numId w:val="2"/>
-        </w:numPr>
-      </w:pPr>
-      <w:r>
-        <w:rPr>
-          <w:sz w:val="22"/>
-          <w:szCs w:val="22"/>
-          <w:rFonts w:ascii="Arial" w:cs="Arial" w:eastAsia="Arial" w:hAnsi="Arial"/>
-        </w:rPr>
-        <w:t xml:space="preserve">Amount displays with standard currency formatting for local currency</w:t>
-      </w:r>
-    </w:p>
-    <w:p>
-      <w:pPr>
-        <w:pStyle w:val="ListParagraph"/>
-        <w:numPr>
-          <w:ilvl w:val="0"/>
-          <w:numId w:val="2"/>
-        </w:numPr>
-      </w:pPr>
-      <w:r>
-        <w:rPr>
-          <w:sz w:val="22"/>
-          <w:szCs w:val="22"/>
-          <w:rFonts w:ascii="Arial" w:cs="Arial" w:eastAsia="Arial" w:hAnsi="Arial"/>
-        </w:rPr>
-        <w:t xml:space="preserve">Due date calculation follows standard SAP payment terms logic</w:t>
-      </w:r>
-    </w:p>
-    <w:p>
-      <w:pPr>
-        <w:pStyle w:val="ListParagraph"/>
-        <w:numPr>
-          <w:ilvl w:val="0"/>
-          <w:numId w:val="2"/>
-        </w:numPr>
-      </w:pPr>
-      <w:r>
-        <w:rPr>
-          <w:sz w:val="22"/>
-          <w:szCs w:val="22"/>
-          <w:rFonts w:ascii="Arial" w:cs="Arial" w:eastAsia="Arial" w:hAnsi="Arial"/>
-        </w:rPr>
-        <w:t xml:space="preserve">Maximum of 50,000 records can be displayed to prevent performance issues</w:t>
+        <w:t xml:space="preserve">IF BSID-AUSGL is not initial THEN exclude the line item from the report output as it represents a cleared item</w:t>
+      </w:r>
+    </w:p>
+    <w:p>
+      <w:pPr>
+        <w:pStyle w:val="ListParagraph"/>
+        <w:numPr>
+          <w:ilvl w:val="0"/>
+          <w:numId w:val="2"/>
+        </w:numPr>
+      </w:pPr>
+      <w:r>
+        <w:rPr>
+          <w:sz w:val="22"/>
+          <w:szCs w:val="22"/>
+          <w:rFonts w:ascii="Arial" w:cs="Arial" w:eastAsia="Arial" w:hAnsi="Arial"/>
+        </w:rPr>
+        <w:t xml:space="preserve">IF user lacks authorization for F_BKPF_BUK with activity 03 for the specified BUKRS THEN display error message and terminate report execution</w:t>
+      </w:r>
+    </w:p>
+    <w:p>
+      <w:pPr>
+        <w:pStyle w:val="ListParagraph"/>
+        <w:numPr>
+          <w:ilvl w:val="0"/>
+          <w:numId w:val="2"/>
+        </w:numPr>
+      </w:pPr>
+      <w:r>
+        <w:rPr>
+          <w:sz w:val="22"/>
+          <w:szCs w:val="22"/>
+          <w:rFonts w:ascii="Arial" w:cs="Arial" w:eastAsia="Arial" w:hAnsi="Arial"/>
+        </w:rPr>
+        <w:t xml:space="preserve">IF posting date range SO_BUDAT-LOW is greater than SO_BUDAT-HIGH THEN display error message 'FROM date cannot be greater than TO date' and prevent execution</w:t>
+      </w:r>
+    </w:p>
+    <w:p>
+      <w:pPr>
+        <w:pStyle w:val="ListParagraph"/>
+        <w:numPr>
+          <w:ilvl w:val="0"/>
+          <w:numId w:val="2"/>
+        </w:numPr>
+      </w:pPr>
+      <w:r>
+        <w:rPr>
+          <w:sz w:val="22"/>
+          <w:szCs w:val="22"/>
+          <w:rFonts w:ascii="Arial" w:cs="Arial" w:eastAsia="Arial" w:hAnsi="Arial"/>
+        </w:rPr>
+        <w:t xml:space="preserve">IF KNA1 customer master record does not exist for BSID-KUNNR THEN display KUNNR as customer number and 'Customer not found' as customer name</w:t>
+      </w:r>
+    </w:p>
+    <w:p>
+      <w:pPr>
+        <w:pStyle w:val="ListParagraph"/>
+        <w:numPr>
+          <w:ilvl w:val="0"/>
+          <w:numId w:val="2"/>
+        </w:numPr>
+      </w:pPr>
+      <w:r>
+        <w:rPr>
+          <w:sz w:val="22"/>
+          <w:szCs w:val="22"/>
+          <w:rFonts w:ascii="Arial" w:cs="Arial" w:eastAsia="Arial" w:hAnsi="Arial"/>
+        </w:rPr>
+        <w:t xml:space="preserve">IF BSID-DMBTR is negative THEN display amount as credit balance with appropriate formatting and color coding in ALV Grid</w:t>
+      </w:r>
+    </w:p>
+    <w:p>
+      <w:pPr>
+        <w:pStyle w:val="ListParagraph"/>
+        <w:numPr>
+          <w:ilvl w:val="0"/>
+          <w:numId w:val="2"/>
+        </w:numPr>
+      </w:pPr>
+      <w:r>
+        <w:rPr>
+          <w:sz w:val="22"/>
+          <w:szCs w:val="22"/>
+          <w:rFonts w:ascii="Arial" w:cs="Arial" w:eastAsia="Arial" w:hAnsi="Arial"/>
+        </w:rPr>
+        <w:t xml:space="preserve">IF BSID-ZFBDT is initial or less than BSID-BUDAT THEN calculate due date as BUDAT plus 30 days default payment terms</w:t>
+      </w:r>
+    </w:p>
+    <w:p>
+      <w:pPr>
+        <w:pStyle w:val="ListParagraph"/>
+        <w:numPr>
+          <w:ilvl w:val="0"/>
+          <w:numId w:val="2"/>
+        </w:numPr>
+      </w:pPr>
+      <w:r>
+        <w:rPr>
+          <w:sz w:val="22"/>
+          <w:szCs w:val="22"/>
+          <w:rFonts w:ascii="Arial" w:cs="Arial" w:eastAsia="Arial" w:hAnsi="Arial"/>
+        </w:rPr>
+        <w:t xml:space="preserve">IF no records found for specified selection criteria THEN display empty ALV Grid with informational message 'No open items found for company code &amp;1'</w:t>
+      </w:r>
+    </w:p>
+    <w:p>
+      <w:pPr>
+        <w:pStyle w:val="ListParagraph"/>
+        <w:numPr>
+          <w:ilvl w:val="0"/>
+          <w:numId w:val="2"/>
+        </w:numPr>
+      </w:pPr>
+      <w:r>
+        <w:rPr>
+          <w:sz w:val="22"/>
+          <w:szCs w:val="22"/>
+          <w:rFonts w:ascii="Arial" w:cs="Arial" w:eastAsia="Arial" w:hAnsi="Arial"/>
+        </w:rPr>
+        <w:t xml:space="preserve">IF system encounters database error during BSID selection THEN log error in application log and display user-friendly message 'Technical error occurred. Contact system administrator'</w:t>
       </w:r>
     </w:p>
     <w:p>
@@ -1885,92 +1885,75 @@
           <w:szCs w:val="22"/>
           <w:rFonts w:ascii="Arial" w:cs="Arial" w:eastAsia="Arial" w:hAnsi="Arial"/>
         </w:rPr>
-        <w:t xml:space="preserve">Authorization failure displays standard SAP authorization error message and terminates report</w:t>
-      </w:r>
-    </w:p>
-    <w:p>
-      <w:pPr>
-        <w:pStyle w:val="ListParagraph"/>
-        <w:numPr>
-          <w:ilvl w:val="0"/>
-          <w:numId w:val="2"/>
-        </w:numPr>
-      </w:pPr>
-      <w:r>
-        <w:rPr>
-          <w:sz w:val="22"/>
-          <w:szCs w:val="22"/>
-          <w:rFonts w:ascii="Arial" w:cs="Arial" w:eastAsia="Arial" w:hAnsi="Arial"/>
-        </w:rPr>
-        <w:t xml:space="preserve">No data found scenario displays informational message 'No open items found for selection criteria'</w:t>
-      </w:r>
-    </w:p>
-    <w:p>
-      <w:pPr>
-        <w:pStyle w:val="ListParagraph"/>
-        <w:numPr>
-          <w:ilvl w:val="0"/>
-          <w:numId w:val="2"/>
-        </w:numPr>
-      </w:pPr>
-      <w:r>
-        <w:rPr>
-          <w:sz w:val="22"/>
-          <w:szCs w:val="22"/>
-          <w:rFonts w:ascii="Arial" w:cs="Arial" w:eastAsia="Arial" w:hAnsi="Arial"/>
-        </w:rPr>
-        <w:t xml:space="preserve">Database connection errors display technical error message with retry option</w:t>
-      </w:r>
-    </w:p>
-    <w:p>
-      <w:pPr>
-        <w:pStyle w:val="ListParagraph"/>
-        <w:numPr>
-          <w:ilvl w:val="0"/>
-          <w:numId w:val="2"/>
-        </w:numPr>
-      </w:pPr>
-      <w:r>
-        <w:rPr>
-          <w:sz w:val="22"/>
-          <w:szCs w:val="22"/>
-          <w:rFonts w:ascii="Arial" w:cs="Arial" w:eastAsia="Arial" w:hAnsi="Arial"/>
-        </w:rPr>
-        <w:t xml:space="preserve">Invalid date range (FROM &gt; TO) displays error message and highlights date fields</w:t>
-      </w:r>
-    </w:p>
-    <w:p>
-      <w:pPr>
-        <w:pStyle w:val="ListParagraph"/>
-        <w:numPr>
-          <w:ilvl w:val="0"/>
-          <w:numId w:val="2"/>
-        </w:numPr>
-      </w:pPr>
-      <w:r>
-        <w:rPr>
-          <w:sz w:val="22"/>
-          <w:szCs w:val="22"/>
-          <w:rFonts w:ascii="Arial" w:cs="Arial" w:eastAsia="Arial" w:hAnsi="Arial"/>
-        </w:rPr>
-        <w:t xml:space="preserve">Performance timeout after 300 seconds displays warning message and partial results</w:t>
-      </w:r>
-    </w:p>
-    <w:p>
-      <w:pPr>
-        <w:pStyle w:val="ListParagraph"/>
-        <w:numPr>
-          <w:ilvl w:val="0"/>
-          <w:numId w:val="2"/>
-        </w:numPr>
-      </w:pPr>
-      <w:r>
-        <w:rPr>
-          <w:sz w:val="22"/>
-          <w:szCs w:val="22"/>
-          <w:rFonts w:ascii="Arial" w:cs="Arial" w:eastAsia="Arial" w:hAnsi="Arial"/>
-        </w:rPr>
-        <w:t xml:space="preserve">Missing customer master data logs warning but continues processing with default text</w:t>
+        <w:t xml:space="preserve">Authorization Error: Display message 'No authorization for company code &amp;1' (message class ZFI, message number 001) when F_BKPF_BUK authorization check fails and terminate report execution gracefully</w:t>
+      </w:r>
+    </w:p>
+    <w:p>
+      <w:pPr>
+        <w:pStyle w:val="ListParagraph"/>
+        <w:numPr>
+          <w:ilvl w:val="0"/>
+          <w:numId w:val="2"/>
+        </w:numPr>
+      </w:pPr>
+      <w:r>
+        <w:rPr>
+          <w:sz w:val="22"/>
+          <w:szCs w:val="22"/>
+          <w:rFonts w:ascii="Arial" w:cs="Arial" w:eastAsia="Arial" w:hAnsi="Arial"/>
+        </w:rPr>
+        <w:t xml:space="preserve">Invalid Date Range Error: Display message 'FROM date &amp;1 cannot be greater than TO date &amp;2' when SO_BUDAT-LOW &gt; SO_BUDAT-HIGH and return to selection screen for correction</w:t>
+      </w:r>
+    </w:p>
+    <w:p>
+      <w:pPr>
+        <w:pStyle w:val="ListParagraph"/>
+        <w:numPr>
+          <w:ilvl w:val="0"/>
+          <w:numId w:val="2"/>
+        </w:numPr>
+      </w:pPr>
+      <w:r>
+        <w:rPr>
+          <w:sz w:val="22"/>
+          <w:szCs w:val="22"/>
+          <w:rFonts w:ascii="Arial" w:cs="Arial" w:eastAsia="Arial" w:hAnsi="Arial"/>
+        </w:rPr>
+        <w:t xml:space="preserve">Database Connection Error: Display message 'Database connection error. Please try again later' when database access fails and log technical details in application log ZFIN_REPORTS</w:t>
+      </w:r>
+    </w:p>
+    <w:p>
+      <w:pPr>
+        <w:pStyle w:val="ListParagraph"/>
+        <w:numPr>
+          <w:ilvl w:val="0"/>
+          <w:numId w:val="2"/>
+        </w:numPr>
+      </w:pPr>
+      <w:r>
+        <w:rPr>
+          <w:sz w:val="22"/>
+          <w:szCs w:val="22"/>
+          <w:rFonts w:ascii="Arial" w:cs="Arial" w:eastAsia="Arial" w:hAnsi="Arial"/>
+        </w:rPr>
+        <w:t xml:space="preserve">No Data Found Scenario: Display informational message 'No open customer line items found for specified criteria' and present empty ALV Grid for user review</w:t>
+      </w:r>
+    </w:p>
+    <w:p>
+      <w:pPr>
+        <w:pStyle w:val="ListParagraph"/>
+        <w:numPr>
+          <w:ilvl w:val="0"/>
+          <w:numId w:val="2"/>
+        </w:numPr>
+      </w:pPr>
+      <w:r>
+        <w:rPr>
+          <w:sz w:val="22"/>
+          <w:szCs w:val="22"/>
+          <w:rFonts w:ascii="Arial" w:cs="Arial" w:eastAsia="Arial" w:hAnsi="Arial"/>
+        </w:rPr>
+        <w:t xml:space="preserve">Memory Allocation Error: Display message 'Insufficient memory for data processing. Please restrict selection criteria' when internal table size exceeds system limits and provide guidance for criteria refinement</w:t>
       </w:r>
     </w:p>
     <w:p>
@@ -1998,7 +1981,7 @@
           <w:szCs w:val="22"/>
           <w:rFonts w:ascii="Arial" w:cs="Arial" w:eastAsia="Arial" w:hAnsi="Arial"/>
         </w:rPr>
-        <w:t xml:space="preserve">Users require authorization for authorization object F_BKPF_BUK (Accounting Document Authorization) with activity 03 (Display) for the specified company codes. Additionally, users need SAP_ALL or equivalent authorization for report execution (S_DEVELOP object) and ALV display functions. Finance functional roles should be configured to include ZFIN_OPEN_ITEMS in the appropriate role menu structure.</w:t>
+        <w:t xml:space="preserve">The report requires authorization object F_BKPF_BUK with activity 03 (Display) for the specified company code to control access to financial document line items. Users must be assigned to SAP business role SAP_BR_GL_ACCOUNTANT or custom role ZFI_REPORTER with appropriate company code authorizations. Additional authorization object S_TCODE with transaction code access is required for report execution through custom transaction. The authorization concept follows the principle of least privilege, ensuring users can only access company codes within their designated organizational scope. Authorization failures shall be logged in security audit log for compliance monitoring and access review purposes.</w:t>
       </w:r>
     </w:p>
     <w:p>
@@ -2026,7 +2009,7 @@
           <w:szCs w:val="22"/>
           <w:rFonts w:ascii="Arial" w:cs="Arial" w:eastAsia="Arial" w:hAnsi="Arial"/>
         </w:rPr>
-        <w:t xml:space="preserve">N/A - This development creates a report rather than consuming reporting services. The ALV Grid output serves as the reporting mechanism with standard export capabilities to Excel, XML, and other formats supported by SAP ALV framework.</w:t>
+        <w:t xml:space="preserve">The ALV Grid shall display data sorted by Customer Number (KUNNR) in ascending order as primary sort and Document Number (BELNR) in ascending order as secondary sort. Subtotals shall be calculated for Amount in Local Currency (DMBTR) grouped by Customer Number with grand total displayed at the report bottom. The ALV Grid shall support standard export formats including Excel (.xlsx), CSV (.csv), and PDF for offline analysis and documentation purposes. Column widths shall be optimized automatically based on data content with minimum width of 10 characters per column. The report shall include standard ALV functionalities such as column filtering, sorting, and layout save/restore capabilities. Print functionality shall be available with landscape orientation and company code header information displayed on each page.</w:t>
       </w:r>
     </w:p>
     <w:p>
@@ -2061,92 +2044,92 @@
           <w:szCs w:val="22"/>
           <w:rFonts w:ascii="Arial" w:cs="Arial" w:eastAsia="Arial" w:hAnsi="Arial"/>
         </w:rPr>
-        <w:t xml:space="preserve">Assumption: BSID table contains current fiscal year data - archive handling not required</w:t>
-      </w:r>
-    </w:p>
-    <w:p>
-      <w:pPr>
-        <w:pStyle w:val="ListParagraph"/>
-        <w:numPr>
-          <w:ilvl w:val="0"/>
-          <w:numId w:val="2"/>
-        </w:numPr>
-      </w:pPr>
-      <w:r>
-        <w:rPr>
-          <w:sz w:val="22"/>
-          <w:szCs w:val="22"/>
-          <w:rFonts w:ascii="Arial" w:cs="Arial" w:eastAsia="Arial" w:hAnsi="Arial"/>
-        </w:rPr>
-        <w:t xml:space="preserve">Assumption: Local currency amounts are sufficient - no foreign currency conversion needed</w:t>
-      </w:r>
-    </w:p>
-    <w:p>
-      <w:pPr>
-        <w:pStyle w:val="ListParagraph"/>
-        <w:numPr>
-          <w:ilvl w:val="0"/>
-          <w:numId w:val="2"/>
-        </w:numPr>
-      </w:pPr>
-      <w:r>
-        <w:rPr>
-          <w:sz w:val="22"/>
-          <w:szCs w:val="22"/>
-          <w:rFonts w:ascii="Arial" w:cs="Arial" w:eastAsia="Arial" w:hAnsi="Arial"/>
-        </w:rPr>
-        <w:t xml:space="preserve">Dependency: F_BKPF_BUK authorization object must be properly configured in user roles</w:t>
-      </w:r>
-    </w:p>
-    <w:p>
-      <w:pPr>
-        <w:pStyle w:val="ListParagraph"/>
-        <w:numPr>
-          <w:ilvl w:val="0"/>
-          <w:numId w:val="2"/>
-        </w:numPr>
-      </w:pPr>
-      <w:r>
-        <w:rPr>
-          <w:sz w:val="22"/>
-          <w:szCs w:val="22"/>
-          <w:rFonts w:ascii="Arial" w:cs="Arial" w:eastAsia="Arial" w:hAnsi="Arial"/>
-        </w:rPr>
-        <w:t xml:space="preserve">Dependency: KNA1 and BSID table access must be available in target system</w:t>
-      </w:r>
-    </w:p>
-    <w:p>
-      <w:pPr>
-        <w:pStyle w:val="ListParagraph"/>
-        <w:numPr>
-          <w:ilvl w:val="0"/>
-          <w:numId w:val="2"/>
-        </w:numPr>
-      </w:pPr>
-      <w:r>
-        <w:rPr>
-          <w:sz w:val="22"/>
-          <w:szCs w:val="22"/>
-          <w:rFonts w:ascii="Arial" w:cs="Arial" w:eastAsia="Arial" w:hAnsi="Arial"/>
-        </w:rPr>
-        <w:t xml:space="preserve">Open Item: Performance testing required for systems with large data volumes</w:t>
-      </w:r>
-    </w:p>
-    <w:p>
-      <w:pPr>
-        <w:pStyle w:val="ListParagraph"/>
-        <w:numPr>
-          <w:ilvl w:val="0"/>
-          <w:numId w:val="2"/>
-        </w:numPr>
-      </w:pPr>
-      <w:r>
-        <w:rPr>
-          <w:sz w:val="22"/>
-          <w:szCs w:val="22"/>
-          <w:rFonts w:ascii="Arial" w:cs="Arial" w:eastAsia="Arial" w:hAnsi="Arial"/>
-        </w:rPr>
-        <w:t xml:space="preserve">Open Item: User training materials and documentation to be provided separately</w:t>
+        <w:t xml:space="preserve">Assumption: Customer line items table BSID contains only debit positions and credit positions are stored in table BSIK for vendor line items</w:t>
+      </w:r>
+    </w:p>
+    <w:p>
+      <w:pPr>
+        <w:pStyle w:val="ListParagraph"/>
+        <w:numPr>
+          <w:ilvl w:val="0"/>
+          <w:numId w:val="2"/>
+        </w:numPr>
+      </w:pPr>
+      <w:r>
+        <w:rPr>
+          <w:sz w:val="22"/>
+          <w:szCs w:val="22"/>
+          <w:rFonts w:ascii="Arial" w:cs="Arial" w:eastAsia="Arial" w:hAnsi="Arial"/>
+        </w:rPr>
+        <w:t xml:space="preserve">Assumption: Payment terms calculation logic is standardized across all company codes and follows SAP standard configuration in table T052</w:t>
+      </w:r>
+    </w:p>
+    <w:p>
+      <w:pPr>
+        <w:pStyle w:val="ListParagraph"/>
+        <w:numPr>
+          <w:ilvl w:val="0"/>
+          <w:numId w:val="2"/>
+        </w:numPr>
+      </w:pPr>
+      <w:r>
+        <w:rPr>
+          <w:sz w:val="22"/>
+          <w:szCs w:val="22"/>
+          <w:rFonts w:ascii="Arial" w:cs="Arial" w:eastAsia="Arial" w:hAnsi="Arial"/>
+        </w:rPr>
+        <w:t xml:space="preserve">Assumption: Customer master data in table KNA1 is maintained and current for all customer numbers referenced in BSID table</w:t>
+      </w:r>
+    </w:p>
+    <w:p>
+      <w:pPr>
+        <w:pStyle w:val="ListParagraph"/>
+        <w:numPr>
+          <w:ilvl w:val="0"/>
+          <w:numId w:val="2"/>
+        </w:numPr>
+      </w:pPr>
+      <w:r>
+        <w:rPr>
+          <w:sz w:val="22"/>
+          <w:szCs w:val="22"/>
+          <w:rFonts w:ascii="Arial" w:cs="Arial" w:eastAsia="Arial" w:hAnsi="Arial"/>
+        </w:rPr>
+        <w:t xml:space="preserve">Dependency: Authorization object F_BKPF_BUK must be properly configured in production system with appropriate activity assignments</w:t>
+      </w:r>
+    </w:p>
+    <w:p>
+      <w:pPr>
+        <w:pStyle w:val="ListParagraph"/>
+        <w:numPr>
+          <w:ilvl w:val="0"/>
+          <w:numId w:val="2"/>
+        </w:numPr>
+      </w:pPr>
+      <w:r>
+        <w:rPr>
+          <w:sz w:val="22"/>
+          <w:szCs w:val="22"/>
+          <w:rFonts w:ascii="Arial" w:cs="Arial" w:eastAsia="Arial" w:hAnsi="Arial"/>
+        </w:rPr>
+        <w:t xml:space="preserve">Dependency: Custom package ZFINANCE must exist in target system with appropriate transport layer assignment for object creation</w:t>
+      </w:r>
+    </w:p>
+    <w:p>
+      <w:pPr>
+        <w:pStyle w:val="ListParagraph"/>
+        <w:numPr>
+          <w:ilvl w:val="0"/>
+          <w:numId w:val="2"/>
+        </w:numPr>
+      </w:pPr>
+      <w:r>
+        <w:rPr>
+          <w:sz w:val="22"/>
+          <w:szCs w:val="22"/>
+          <w:rFonts w:ascii="Arial" w:cs="Arial" w:eastAsia="Arial" w:hAnsi="Arial"/>
+        </w:rPr>
+        <w:t xml:space="preserve">Assumption: ALV Grid display framework is available and properly configured in the target SAP system environment</w:t>
       </w:r>
     </w:p>
     <w:p>

</xml_diff>